<commit_message>
-message box now disables inputs and buttons when it appears and disables when it disappears -settings no longer saves write frequency and framerate (NonSerializable) -minor changes in the message box prefab (button label margins) -minor scene changes -first iteration user manual
</commit_message>
<xml_diff>
--- a/Assets/User Manual/UserManual.docx
+++ b/Assets/User Manual/UserManual.docx
@@ -4,20 +4,1167 @@
   <w:body>
     <w:p>
       <w:pPr>
-        <w:rPr>
-          <w:rFonts w:hint="default"/>
-          <w:lang w:val="el-GR"/>
-        </w:rPr>
-      </w:pPr>
-      <w:r>
-        <w:rPr>
-          <w:rFonts w:hint="default"/>
+        <w:pStyle w:val="2"/>
+        <w:bidi w:val="0"/>
+        <w:spacing w:line="240" w:lineRule="auto"/>
+        <w:jc w:val="both"/>
+        <w:rPr>
+          <w:rFonts w:hint="default" w:ascii="Times New Roman" w:hAnsi="Times New Roman" w:cs="Times New Roman"/>
+          <w:lang w:val="el-GR"/>
+        </w:rPr>
+      </w:pPr>
+      <w:r>
+        <w:rPr>
+          <w:rFonts w:hint="default" w:ascii="Times New Roman" w:hAnsi="Times New Roman" w:cs="Times New Roman"/>
           <w:lang w:val="el-GR"/>
         </w:rPr>
         <w:t>Οδηγός Χρήσης προγράμματος</w:t>
+      </w:r>
+    </w:p>
+    <w:p>
+      <w:pPr>
+        <w:jc w:val="both"/>
+        <w:rPr>
+          <w:rFonts w:hint="default" w:ascii="Times New Roman" w:hAnsi="Times New Roman" w:cs="Times New Roman"/>
+          <w:lang w:val="en-US"/>
+        </w:rPr>
+      </w:pPr>
+    </w:p>
+    <w:p>
+      <w:pPr>
+        <w:pStyle w:val="3"/>
+        <w:bidi w:val="0"/>
+        <w:spacing w:line="240" w:lineRule="auto"/>
+        <w:jc w:val="both"/>
+        <w:rPr>
+          <w:rFonts w:hint="default" w:ascii="Times New Roman" w:hAnsi="Times New Roman" w:cs="Times New Roman"/>
+          <w:lang w:val="el-GR"/>
+        </w:rPr>
+      </w:pPr>
+      <w:r>
+        <w:rPr>
+          <w:rFonts w:hint="default" w:ascii="Times New Roman" w:hAnsi="Times New Roman" w:cs="Times New Roman"/>
+          <w:lang w:val="el-GR"/>
+        </w:rPr>
+        <w:t>Είσοδος στο πρόγραμμα</w:t>
+      </w:r>
+    </w:p>
+    <w:p>
+      <w:pPr>
+        <w:jc w:val="both"/>
+        <w:rPr>
+          <w:rFonts w:hint="default" w:ascii="Times New Roman" w:hAnsi="Times New Roman" w:cs="Times New Roman"/>
+          <w:lang w:val="el-GR"/>
+        </w:rPr>
+      </w:pPr>
+      <w:r>
+        <w:rPr>
+          <w:rFonts w:hint="default" w:ascii="Times New Roman" w:hAnsi="Times New Roman" w:cs="Times New Roman"/>
+        </w:rPr>
+        <w:drawing>
+          <wp:inline distT="0" distB="0" distL="114300" distR="114300">
+            <wp:extent cx="5264785" cy="2921635"/>
+            <wp:effectExtent l="0" t="0" r="12065" b="12065"/>
+            <wp:docPr id="2" name="Picture 2"/>
+            <wp:cNvGraphicFramePr>
+              <a:graphicFrameLocks xmlns:a="http://schemas.openxmlformats.org/drawingml/2006/main" noChangeAspect="1"/>
+            </wp:cNvGraphicFramePr>
+            <a:graphic xmlns:a="http://schemas.openxmlformats.org/drawingml/2006/main">
+              <a:graphicData uri="http://schemas.openxmlformats.org/drawingml/2006/picture">
+                <pic:pic xmlns:pic="http://schemas.openxmlformats.org/drawingml/2006/picture">
+                  <pic:nvPicPr>
+                    <pic:cNvPr id="2" name="Picture 2"/>
+                    <pic:cNvPicPr>
+                      <a:picLocks noChangeAspect="1"/>
+                    </pic:cNvPicPr>
+                  </pic:nvPicPr>
+                  <pic:blipFill>
+                    <a:blip r:embed="rId4"/>
+                    <a:stretch>
+                      <a:fillRect/>
+                    </a:stretch>
+                  </pic:blipFill>
+                  <pic:spPr>
+                    <a:xfrm>
+                      <a:off x="0" y="0"/>
+                      <a:ext cx="5264785" cy="2921635"/>
+                    </a:xfrm>
+                    <a:prstGeom prst="rect">
+                      <a:avLst/>
+                    </a:prstGeom>
+                    <a:noFill/>
+                    <a:ln>
+                      <a:noFill/>
+                    </a:ln>
+                  </pic:spPr>
+                </pic:pic>
+              </a:graphicData>
+            </a:graphic>
+          </wp:inline>
+        </w:drawing>
+      </w:r>
+    </w:p>
+    <w:p>
+      <w:pPr>
+        <w:jc w:val="both"/>
+        <w:rPr>
+          <w:rFonts w:hint="default" w:ascii="Times New Roman" w:hAnsi="Times New Roman" w:cs="Times New Roman"/>
+          <w:lang w:val="en-US"/>
+        </w:rPr>
+      </w:pPr>
+    </w:p>
+    <w:p>
+      <w:pPr>
+        <w:pStyle w:val="4"/>
+        <w:bidi w:val="0"/>
+        <w:spacing w:line="240" w:lineRule="auto"/>
+        <w:jc w:val="both"/>
+        <w:rPr>
+          <w:rFonts w:hint="default" w:ascii="Times New Roman" w:hAnsi="Times New Roman" w:cs="Times New Roman"/>
+          <w:lang w:val="el-GR"/>
+        </w:rPr>
+      </w:pPr>
+      <w:r>
+        <w:rPr>
+          <w:rFonts w:hint="default" w:ascii="Times New Roman" w:hAnsi="Times New Roman" w:cs="Times New Roman"/>
+          <w:lang w:val="el-GR"/>
+        </w:rPr>
+        <w:t>Πρώτη χρήση</w:t>
+      </w:r>
+    </w:p>
+    <w:p>
+      <w:pPr>
+        <w:jc w:val="center"/>
+        <w:rPr>
+          <w:rFonts w:hint="default" w:ascii="Times New Roman" w:hAnsi="Times New Roman" w:cs="Times New Roman"/>
+          <w:lang w:val="el-GR"/>
+        </w:rPr>
+      </w:pPr>
+      <w:r>
+        <w:drawing>
+          <wp:inline distT="0" distB="0" distL="114300" distR="114300">
+            <wp:extent cx="3810000" cy="2667000"/>
+            <wp:effectExtent l="0" t="0" r="0" b="0"/>
+            <wp:docPr id="9" name="Picture 9"/>
+            <wp:cNvGraphicFramePr>
+              <a:graphicFrameLocks xmlns:a="http://schemas.openxmlformats.org/drawingml/2006/main" noChangeAspect="1"/>
+            </wp:cNvGraphicFramePr>
+            <a:graphic xmlns:a="http://schemas.openxmlformats.org/drawingml/2006/main">
+              <a:graphicData uri="http://schemas.openxmlformats.org/drawingml/2006/picture">
+                <pic:pic xmlns:pic="http://schemas.openxmlformats.org/drawingml/2006/picture">
+                  <pic:nvPicPr>
+                    <pic:cNvPr id="9" name="Picture 9"/>
+                    <pic:cNvPicPr>
+                      <a:picLocks noChangeAspect="1"/>
+                    </pic:cNvPicPr>
+                  </pic:nvPicPr>
+                  <pic:blipFill>
+                    <a:blip r:embed="rId5"/>
+                    <a:stretch>
+                      <a:fillRect/>
+                    </a:stretch>
+                  </pic:blipFill>
+                  <pic:spPr>
+                    <a:xfrm>
+                      <a:off x="0" y="0"/>
+                      <a:ext cx="3810000" cy="2667000"/>
+                    </a:xfrm>
+                    <a:prstGeom prst="rect">
+                      <a:avLst/>
+                    </a:prstGeom>
+                    <a:noFill/>
+                    <a:ln>
+                      <a:noFill/>
+                    </a:ln>
+                  </pic:spPr>
+                </pic:pic>
+              </a:graphicData>
+            </a:graphic>
+          </wp:inline>
+        </w:drawing>
+      </w:r>
+    </w:p>
+    <w:p>
+      <w:pPr>
+        <w:jc w:val="both"/>
+        <w:rPr>
+          <w:rFonts w:hint="default" w:ascii="Times New Roman" w:hAnsi="Times New Roman" w:cs="Times New Roman"/>
+          <w:sz w:val="24"/>
+          <w:szCs w:val="24"/>
+          <w:lang w:val="el-GR"/>
+        </w:rPr>
+      </w:pPr>
+      <w:r>
+        <w:rPr>
+          <w:rFonts w:hint="default" w:ascii="Times New Roman" w:hAnsi="Times New Roman" w:cs="Times New Roman"/>
+          <w:sz w:val="24"/>
+          <w:szCs w:val="24"/>
+          <w:lang w:val="el-GR"/>
+        </w:rPr>
+        <w:t>Κατά την πρώτη χρήση, το πρόγραμμα θα ζητήσει από τον χρήστη εάν επιθυμεί δημιουργία ή εισαγωγή βάσης δεδομένων:</w:t>
+      </w:r>
+    </w:p>
+    <w:p>
+      <w:pPr>
+        <w:numPr>
+          <w:ilvl w:val="0"/>
+          <w:numId w:val="1"/>
+        </w:numPr>
+        <w:ind w:left="420" w:leftChars="0" w:hanging="420" w:firstLineChars="0"/>
+        <w:jc w:val="both"/>
+        <w:rPr>
+          <w:rFonts w:hint="default" w:ascii="Times New Roman" w:hAnsi="Times New Roman" w:cs="Times New Roman"/>
+          <w:sz w:val="24"/>
+          <w:szCs w:val="24"/>
+          <w:lang w:val="el-GR"/>
+        </w:rPr>
+      </w:pPr>
+      <w:r>
+        <w:rPr>
+          <w:rFonts w:hint="default" w:ascii="Times New Roman" w:hAnsi="Times New Roman" w:cs="Times New Roman"/>
+          <w:sz w:val="24"/>
+          <w:szCs w:val="24"/>
+          <w:lang w:val="el-GR"/>
+        </w:rPr>
+        <w:t xml:space="preserve">Για εισαγωγή, χρησιμοποιούμε το κουμπί “Εισαγωγή” όπου ανοίγει ένα διάλογο επιλογής αρχείου </w:t>
+      </w:r>
+      <w:r>
+        <w:rPr>
+          <w:rFonts w:hint="default" w:ascii="Times New Roman" w:hAnsi="Times New Roman" w:cs="Times New Roman"/>
+          <w:sz w:val="24"/>
+          <w:szCs w:val="24"/>
+          <w:lang w:val="en-US"/>
+        </w:rPr>
+        <w:t>.db</w:t>
+      </w:r>
+      <w:r>
+        <w:rPr>
+          <w:rFonts w:hint="default" w:ascii="Times New Roman" w:hAnsi="Times New Roman" w:cs="Times New Roman"/>
+          <w:sz w:val="24"/>
+          <w:szCs w:val="24"/>
+          <w:lang w:val="el-GR"/>
+        </w:rPr>
+        <w:t>. Ο διάλογος θα δείχνει μόνο φακέλους και αρχεία</w:t>
+      </w:r>
+      <w:r>
+        <w:rPr>
+          <w:rFonts w:hint="default" w:ascii="Times New Roman" w:hAnsi="Times New Roman" w:cs="Times New Roman"/>
+          <w:sz w:val="24"/>
+          <w:szCs w:val="24"/>
+          <w:lang w:val="en-US"/>
+        </w:rPr>
+        <w:t xml:space="preserve"> .db. </w:t>
+      </w:r>
+      <w:r>
+        <w:rPr>
+          <w:rFonts w:hint="default" w:ascii="Times New Roman" w:hAnsi="Times New Roman" w:cs="Times New Roman"/>
+        </w:rPr>
+        <w:drawing>
+          <wp:inline distT="0" distB="0" distL="114300" distR="114300">
+            <wp:extent cx="5269230" cy="3514725"/>
+            <wp:effectExtent l="0" t="0" r="7620" b="9525"/>
+            <wp:docPr id="6" name="Picture 6"/>
+            <wp:cNvGraphicFramePr>
+              <a:graphicFrameLocks xmlns:a="http://schemas.openxmlformats.org/drawingml/2006/main" noChangeAspect="1"/>
+            </wp:cNvGraphicFramePr>
+            <a:graphic xmlns:a="http://schemas.openxmlformats.org/drawingml/2006/main">
+              <a:graphicData uri="http://schemas.openxmlformats.org/drawingml/2006/picture">
+                <pic:pic xmlns:pic="http://schemas.openxmlformats.org/drawingml/2006/picture">
+                  <pic:nvPicPr>
+                    <pic:cNvPr id="6" name="Picture 6"/>
+                    <pic:cNvPicPr>
+                      <a:picLocks noChangeAspect="1"/>
+                    </pic:cNvPicPr>
+                  </pic:nvPicPr>
+                  <pic:blipFill>
+                    <a:blip r:embed="rId6"/>
+                    <a:stretch>
+                      <a:fillRect/>
+                    </a:stretch>
+                  </pic:blipFill>
+                  <pic:spPr>
+                    <a:xfrm>
+                      <a:off x="0" y="0"/>
+                      <a:ext cx="5269230" cy="3514725"/>
+                    </a:xfrm>
+                    <a:prstGeom prst="rect">
+                      <a:avLst/>
+                    </a:prstGeom>
+                    <a:noFill/>
+                    <a:ln>
+                      <a:noFill/>
+                    </a:ln>
+                  </pic:spPr>
+                </pic:pic>
+              </a:graphicData>
+            </a:graphic>
+          </wp:inline>
+        </w:drawing>
+      </w:r>
+      <w:r>
+        <w:rPr>
+          <w:rFonts w:hint="default" w:ascii="Times New Roman" w:hAnsi="Times New Roman" w:cs="Times New Roman"/>
+          <w:lang w:val="el-GR"/>
+        </w:rPr>
+        <w:br w:type="textWrapping"/>
+      </w:r>
+      <w:r>
+        <w:rPr>
+          <w:rFonts w:hint="default" w:ascii="Times New Roman" w:hAnsi="Times New Roman" w:cs="Times New Roman"/>
+          <w:sz w:val="24"/>
+          <w:szCs w:val="24"/>
+          <w:lang w:val="el-GR"/>
+        </w:rPr>
+        <w:t>Επιλέγουμε το αρχείο με διπλό κλικ ή πατώντας στο κουμπί “Επιλογή” και περιμένουμε να τελειώσει η διαδικασία εισαγωγής.</w:t>
+      </w:r>
+      <w:r>
+        <w:rPr>
+          <w:rFonts w:hint="default" w:ascii="Times New Roman" w:hAnsi="Times New Roman" w:cs="Times New Roman"/>
+          <w:sz w:val="24"/>
+          <w:szCs w:val="24"/>
+          <w:lang w:val="el-GR"/>
+        </w:rPr>
+        <w:br w:type="textWrapping"/>
+      </w:r>
+    </w:p>
+    <w:p>
+      <w:pPr>
+        <w:numPr>
+          <w:ilvl w:val="0"/>
+          <w:numId w:val="1"/>
+        </w:numPr>
+        <w:ind w:left="420" w:leftChars="0" w:hanging="420" w:firstLineChars="0"/>
+        <w:jc w:val="both"/>
+        <w:rPr>
+          <w:rFonts w:hint="default" w:ascii="Times New Roman" w:hAnsi="Times New Roman" w:cs="Times New Roman"/>
+          <w:sz w:val="24"/>
+          <w:szCs w:val="24"/>
+          <w:lang w:val="el-GR"/>
+        </w:rPr>
+      </w:pPr>
+      <w:r>
+        <w:rPr>
+          <w:rFonts w:hint="default" w:ascii="Times New Roman" w:hAnsi="Times New Roman" w:cs="Times New Roman"/>
+          <w:sz w:val="24"/>
+          <w:szCs w:val="24"/>
+          <w:lang w:val="el-GR"/>
+        </w:rPr>
+        <w:t>Για δημιουργία, χρησιμοποιούμε το κουμπί “Δημιουργία” το οποίο δημιουργεί μια καινούργια βάση δεδομένων στον υπολογιστή</w:t>
+      </w:r>
+      <w:r>
+        <w:rPr>
+          <w:rFonts w:hint="default" w:ascii="Times New Roman" w:hAnsi="Times New Roman" w:cs="Times New Roman"/>
+          <w:sz w:val="24"/>
+          <w:szCs w:val="24"/>
+          <w:lang w:val="en-US"/>
+        </w:rPr>
+        <w:t>.</w:t>
+      </w:r>
+      <w:r>
+        <w:rPr>
+          <w:rFonts w:hint="default" w:ascii="Times New Roman" w:hAnsi="Times New Roman" w:cs="Times New Roman"/>
+          <w:sz w:val="24"/>
+          <w:szCs w:val="24"/>
+          <w:lang w:val="el-GR"/>
+        </w:rPr>
+        <w:t xml:space="preserve"> Η διαδικασία ενδέχεται να διαρκέσει μερικά δευτερόλεπτα.</w:t>
+      </w:r>
+      <w:r>
+        <w:rPr>
+          <w:rFonts w:hint="default" w:ascii="Times New Roman" w:hAnsi="Times New Roman" w:cs="Times New Roman"/>
+          <w:sz w:val="24"/>
+          <w:szCs w:val="24"/>
+          <w:lang w:val="el-GR"/>
+        </w:rPr>
+        <w:br w:type="textWrapping"/>
+      </w:r>
+      <w:r>
+        <w:drawing>
+          <wp:inline distT="0" distB="0" distL="114300" distR="114300">
+            <wp:extent cx="5273040" cy="1845310"/>
+            <wp:effectExtent l="0" t="0" r="3810" b="2540"/>
+            <wp:docPr id="8" name="Picture 8"/>
+            <wp:cNvGraphicFramePr>
+              <a:graphicFrameLocks xmlns:a="http://schemas.openxmlformats.org/drawingml/2006/main" noChangeAspect="1"/>
+            </wp:cNvGraphicFramePr>
+            <a:graphic xmlns:a="http://schemas.openxmlformats.org/drawingml/2006/main">
+              <a:graphicData uri="http://schemas.openxmlformats.org/drawingml/2006/picture">
+                <pic:pic xmlns:pic="http://schemas.openxmlformats.org/drawingml/2006/picture">
+                  <pic:nvPicPr>
+                    <pic:cNvPr id="8" name="Picture 8"/>
+                    <pic:cNvPicPr>
+                      <a:picLocks noChangeAspect="1"/>
+                    </pic:cNvPicPr>
+                  </pic:nvPicPr>
+                  <pic:blipFill>
+                    <a:blip r:embed="rId7"/>
+                    <a:stretch>
+                      <a:fillRect/>
+                    </a:stretch>
+                  </pic:blipFill>
+                  <pic:spPr>
+                    <a:xfrm>
+                      <a:off x="0" y="0"/>
+                      <a:ext cx="5273040" cy="1845310"/>
+                    </a:xfrm>
+                    <a:prstGeom prst="rect">
+                      <a:avLst/>
+                    </a:prstGeom>
+                    <a:noFill/>
+                    <a:ln>
+                      <a:noFill/>
+                    </a:ln>
+                  </pic:spPr>
+                </pic:pic>
+              </a:graphicData>
+            </a:graphic>
+          </wp:inline>
+        </w:drawing>
+      </w:r>
+      <w:r>
+        <w:br w:type="textWrapping"/>
+      </w:r>
+      <w:r>
+        <w:rPr>
+          <w:rFonts w:hint="default" w:ascii="Times New Roman" w:hAnsi="Times New Roman" w:cs="Times New Roman"/>
+          <w:sz w:val="24"/>
+          <w:szCs w:val="24"/>
+          <w:lang w:val="el-GR"/>
+        </w:rPr>
+        <w:t>Κατά τη δημιουργία της βάσης, εισάγονται σε αυτή οι 3 λογαριασμοί που αναφέρονται παρακάτω καθώς και μερικές επιστασίες.</w:t>
+      </w:r>
+    </w:p>
+    <w:p>
+      <w:pPr>
+        <w:numPr>
+          <w:numId w:val="0"/>
+        </w:numPr>
+        <w:jc w:val="both"/>
+        <w:rPr>
+          <w:rFonts w:hint="default" w:ascii="Times New Roman" w:hAnsi="Times New Roman" w:cs="Times New Roman"/>
+          <w:sz w:val="24"/>
+          <w:szCs w:val="24"/>
+          <w:lang w:val="en-US"/>
+        </w:rPr>
+      </w:pPr>
+    </w:p>
+    <w:p>
+      <w:pPr>
+        <w:numPr>
+          <w:numId w:val="0"/>
+        </w:numPr>
+        <w:jc w:val="both"/>
+        <w:rPr>
+          <w:rFonts w:hint="default" w:ascii="Times New Roman" w:hAnsi="Times New Roman" w:cs="Times New Roman"/>
+          <w:sz w:val="24"/>
+          <w:szCs w:val="24"/>
+          <w:lang w:val="en-US"/>
+        </w:rPr>
+      </w:pPr>
+    </w:p>
+    <w:p>
+      <w:pPr>
+        <w:numPr>
+          <w:numId w:val="0"/>
+        </w:numPr>
+        <w:jc w:val="both"/>
+        <w:rPr>
+          <w:rFonts w:hint="default" w:ascii="Times New Roman" w:hAnsi="Times New Roman" w:cs="Times New Roman"/>
+          <w:sz w:val="24"/>
+          <w:szCs w:val="24"/>
+          <w:lang w:val="el-GR"/>
+        </w:rPr>
+      </w:pPr>
+      <w:r>
+        <w:rPr>
+          <w:rFonts w:hint="default" w:ascii="Times New Roman" w:hAnsi="Times New Roman" w:cs="Times New Roman"/>
+          <w:sz w:val="24"/>
+          <w:szCs w:val="24"/>
+          <w:lang w:val="el-GR"/>
+        </w:rPr>
+        <w:t>Για την είσοδο στο πρόγραμμα, υπάρχουν 3 λογαριασμοί:</w:t>
+      </w:r>
+    </w:p>
+    <w:p>
+      <w:pPr>
+        <w:numPr>
+          <w:ilvl w:val="0"/>
+          <w:numId w:val="2"/>
+        </w:numPr>
+        <w:ind w:left="425" w:leftChars="0" w:hanging="425" w:firstLineChars="0"/>
+        <w:jc w:val="both"/>
+        <w:rPr>
+          <w:rFonts w:hint="default" w:ascii="Times New Roman" w:hAnsi="Times New Roman" w:cs="Times New Roman"/>
+          <w:sz w:val="24"/>
+          <w:szCs w:val="24"/>
+          <w:lang w:val="el-GR"/>
+        </w:rPr>
+      </w:pPr>
+      <w:r>
+        <w:rPr>
+          <w:rFonts w:hint="default" w:ascii="Times New Roman" w:hAnsi="Times New Roman" w:cs="Times New Roman"/>
+          <w:sz w:val="24"/>
+          <w:szCs w:val="24"/>
+          <w:lang w:val="en-US"/>
+        </w:rPr>
+        <w:t>User,</w:t>
+      </w:r>
+      <w:r>
+        <w:rPr>
+          <w:rFonts w:hint="default" w:ascii="Times New Roman" w:hAnsi="Times New Roman" w:cs="Times New Roman"/>
+          <w:sz w:val="24"/>
+          <w:szCs w:val="24"/>
+          <w:lang w:val="el-GR"/>
+        </w:rPr>
+        <w:t xml:space="preserve"> ο οποίος έχει περιορισμένη πρόσβαση στις λειτουργίες του προγράμματος.</w:t>
+      </w:r>
+    </w:p>
+    <w:p>
+      <w:pPr>
+        <w:numPr>
+          <w:ilvl w:val="0"/>
+          <w:numId w:val="2"/>
+        </w:numPr>
+        <w:ind w:left="425" w:leftChars="0" w:hanging="425" w:firstLineChars="0"/>
+        <w:jc w:val="both"/>
+        <w:rPr>
+          <w:rFonts w:hint="default" w:ascii="Times New Roman" w:hAnsi="Times New Roman" w:cs="Times New Roman"/>
+          <w:sz w:val="24"/>
+          <w:szCs w:val="24"/>
+          <w:lang w:val="el-GR"/>
+        </w:rPr>
+      </w:pPr>
+      <w:r>
+        <w:rPr>
+          <w:rFonts w:hint="default" w:ascii="Times New Roman" w:hAnsi="Times New Roman" w:cs="Times New Roman"/>
+          <w:sz w:val="24"/>
+          <w:szCs w:val="24"/>
+          <w:lang w:val="en-US"/>
+        </w:rPr>
+        <w:t xml:space="preserve">Supervisor, </w:t>
+      </w:r>
+      <w:r>
+        <w:rPr>
+          <w:rFonts w:hint="default" w:ascii="Times New Roman" w:hAnsi="Times New Roman" w:cs="Times New Roman"/>
+          <w:sz w:val="24"/>
+          <w:szCs w:val="24"/>
+          <w:lang w:val="el-GR"/>
+        </w:rPr>
+        <w:t xml:space="preserve">ο οποίος έχει αυξημένη πρόσβαση στις λειτουργίες του προγράμματος σε σχέση με τον </w:t>
+      </w:r>
+      <w:r>
+        <w:rPr>
+          <w:rFonts w:hint="default" w:ascii="Times New Roman" w:hAnsi="Times New Roman" w:cs="Times New Roman"/>
+          <w:sz w:val="24"/>
+          <w:szCs w:val="24"/>
+          <w:lang w:val="en-US"/>
+        </w:rPr>
+        <w:t>user.</w:t>
+      </w:r>
+    </w:p>
+    <w:p>
+      <w:pPr>
+        <w:numPr>
+          <w:ilvl w:val="0"/>
+          <w:numId w:val="2"/>
+        </w:numPr>
+        <w:ind w:left="425" w:leftChars="0" w:hanging="425" w:firstLineChars="0"/>
+        <w:jc w:val="both"/>
+        <w:rPr>
+          <w:rFonts w:hint="default" w:ascii="Times New Roman" w:hAnsi="Times New Roman" w:cs="Times New Roman"/>
+          <w:sz w:val="24"/>
+          <w:szCs w:val="24"/>
+          <w:lang w:val="el-GR"/>
+        </w:rPr>
+      </w:pPr>
+      <w:r>
+        <w:rPr>
+          <w:rFonts w:hint="default" w:ascii="Times New Roman" w:hAnsi="Times New Roman" w:cs="Times New Roman"/>
+          <w:sz w:val="24"/>
+          <w:szCs w:val="24"/>
+          <w:lang w:val="en-US"/>
+        </w:rPr>
+        <w:t xml:space="preserve">Admin, </w:t>
+      </w:r>
+      <w:r>
+        <w:rPr>
+          <w:rFonts w:hint="default" w:ascii="Times New Roman" w:hAnsi="Times New Roman" w:cs="Times New Roman"/>
+          <w:sz w:val="24"/>
+          <w:szCs w:val="24"/>
+          <w:lang w:val="el-GR"/>
+        </w:rPr>
+        <w:t>ο οποίος έχει πλήρη πρόσβαση στις λειτουργίες του προγράμματος.</w:t>
+      </w:r>
+    </w:p>
+    <w:p>
+      <w:pPr>
+        <w:numPr>
+          <w:numId w:val="0"/>
+        </w:numPr>
+        <w:jc w:val="both"/>
+        <w:rPr>
+          <w:rFonts w:hint="default" w:ascii="Times New Roman" w:hAnsi="Times New Roman" w:cs="Times New Roman"/>
+          <w:sz w:val="24"/>
+          <w:szCs w:val="24"/>
+          <w:lang w:val="el-GR"/>
+        </w:rPr>
+      </w:pPr>
+    </w:p>
+    <w:p>
+      <w:pPr>
+        <w:pStyle w:val="3"/>
+        <w:bidi w:val="0"/>
+        <w:spacing w:line="240" w:lineRule="auto"/>
+        <w:rPr>
+          <w:rFonts w:hint="default" w:ascii="Times New Roman" w:hAnsi="Times New Roman" w:cs="Times New Roman"/>
+          <w:lang w:val="en-US"/>
+        </w:rPr>
+      </w:pPr>
+      <w:r>
+        <w:rPr>
+          <w:rFonts w:hint="default" w:ascii="Times New Roman" w:hAnsi="Times New Roman" w:cs="Times New Roman"/>
+          <w:lang w:val="el-GR"/>
+        </w:rPr>
+        <w:t xml:space="preserve">Περιγραφή του </w:t>
+      </w:r>
+      <w:r>
+        <w:rPr>
+          <w:rFonts w:hint="default" w:ascii="Times New Roman" w:hAnsi="Times New Roman" w:cs="Times New Roman"/>
+          <w:lang w:val="en-US"/>
+        </w:rPr>
+        <w:t>Interface</w:t>
+      </w:r>
+    </w:p>
+    <w:p>
+      <w:pPr>
+        <w:bidi w:val="0"/>
+        <w:jc w:val="both"/>
+        <w:rPr>
+          <w:rFonts w:hint="default" w:ascii="Times New Roman" w:hAnsi="Times New Roman" w:cs="Times New Roman"/>
+          <w:sz w:val="24"/>
+          <w:szCs w:val="24"/>
+          <w:lang w:val="el-GR"/>
+        </w:rPr>
+      </w:pPr>
+      <w:r>
+        <w:rPr>
+          <w:rFonts w:hint="default" w:ascii="Times New Roman" w:hAnsi="Times New Roman" w:cs="Times New Roman"/>
+          <w:sz w:val="24"/>
+          <w:szCs w:val="24"/>
+          <w:lang w:val="el-GR"/>
+        </w:rPr>
+        <w:t>Όλοι οι χρήστες έχουν ένα μενού επιλογών, το οποίο διαφέρει για τους 3 διαφορετικούς χρήστες. Πατώντας το κουμπί “Μενου” εμφανίζονται/αποκρύπτονται οι διαθέσιμες επιλογές.</w:t>
+      </w:r>
+    </w:p>
+    <w:p>
+      <w:pPr>
+        <w:bidi w:val="0"/>
+        <w:jc w:val="both"/>
+        <w:rPr>
+          <w:rFonts w:hint="default" w:ascii="Times New Roman" w:hAnsi="Times New Roman" w:cs="Times New Roman"/>
+          <w:sz w:val="24"/>
+          <w:szCs w:val="24"/>
+          <w:u w:val="single"/>
+          <w:lang w:val="en-US"/>
+        </w:rPr>
+      </w:pPr>
+      <w:r>
+        <w:rPr>
+          <w:rFonts w:hint="default" w:ascii="Times New Roman" w:hAnsi="Times New Roman" w:cs="Times New Roman"/>
+          <w:sz w:val="24"/>
+          <w:szCs w:val="24"/>
+          <w:u w:val="single"/>
+          <w:lang w:val="en-US"/>
+        </w:rPr>
+        <w:t>User</w:t>
+      </w:r>
+    </w:p>
+    <w:p>
+      <w:pPr>
+        <w:bidi w:val="0"/>
+        <w:jc w:val="both"/>
+        <w:rPr>
+          <w:rFonts w:hint="default" w:ascii="Times New Roman" w:hAnsi="Times New Roman" w:cs="Times New Roman"/>
+          <w:sz w:val="24"/>
+          <w:szCs w:val="24"/>
+          <w:u w:val="none"/>
+          <w:lang w:val="en-US"/>
+        </w:rPr>
+      </w:pPr>
+      <w:r>
+        <w:rPr>
+          <w:rFonts w:hint="default" w:ascii="Times New Roman" w:hAnsi="Times New Roman" w:cs="Times New Roman"/>
+          <w:sz w:val="24"/>
+          <w:szCs w:val="24"/>
+          <w:u w:val="none"/>
+          <w:lang w:val="en-US"/>
+        </w:rPr>
+        <w:drawing>
+          <wp:inline distT="0" distB="0" distL="114300" distR="114300">
+            <wp:extent cx="5262245" cy="150495"/>
+            <wp:effectExtent l="0" t="0" r="14605" b="1905"/>
+            <wp:docPr id="10" name="Picture 10" descr="user_menu"/>
+            <wp:cNvGraphicFramePr>
+              <a:graphicFrameLocks xmlns:a="http://schemas.openxmlformats.org/drawingml/2006/main" noChangeAspect="1"/>
+            </wp:cNvGraphicFramePr>
+            <a:graphic xmlns:a="http://schemas.openxmlformats.org/drawingml/2006/main">
+              <a:graphicData uri="http://schemas.openxmlformats.org/drawingml/2006/picture">
+                <pic:pic xmlns:pic="http://schemas.openxmlformats.org/drawingml/2006/picture">
+                  <pic:nvPicPr>
+                    <pic:cNvPr id="10" name="Picture 10" descr="user_menu"/>
+                    <pic:cNvPicPr>
+                      <a:picLocks noChangeAspect="1"/>
+                    </pic:cNvPicPr>
+                  </pic:nvPicPr>
+                  <pic:blipFill>
+                    <a:blip r:embed="rId8"/>
+                    <a:stretch>
+                      <a:fillRect/>
+                    </a:stretch>
+                  </pic:blipFill>
+                  <pic:spPr>
+                    <a:xfrm>
+                      <a:off x="0" y="0"/>
+                      <a:ext cx="5262245" cy="150495"/>
+                    </a:xfrm>
+                    <a:prstGeom prst="rect">
+                      <a:avLst/>
+                    </a:prstGeom>
+                  </pic:spPr>
+                </pic:pic>
+              </a:graphicData>
+            </a:graphic>
+          </wp:inline>
+        </w:drawing>
+      </w:r>
+    </w:p>
+    <w:p>
+      <w:pPr>
+        <w:bidi w:val="0"/>
+        <w:jc w:val="both"/>
+        <w:rPr>
+          <w:rFonts w:hint="default" w:ascii="Times New Roman" w:hAnsi="Times New Roman" w:cs="Times New Roman"/>
+          <w:sz w:val="24"/>
+          <w:szCs w:val="24"/>
+          <w:u w:val="none"/>
+          <w:lang w:val="el-GR"/>
+        </w:rPr>
+      </w:pPr>
+      <w:r>
+        <w:rPr>
+          <w:rFonts w:hint="default" w:ascii="Times New Roman" w:hAnsi="Times New Roman" w:cs="Times New Roman"/>
+          <w:sz w:val="24"/>
+          <w:szCs w:val="24"/>
+          <w:u w:val="none"/>
+          <w:lang w:val="el-GR"/>
+        </w:rPr>
+        <w:t>Από αριστερά προς δεξιά:</w:t>
+      </w:r>
+    </w:p>
+    <w:p>
+      <w:pPr>
+        <w:bidi w:val="0"/>
+        <w:jc w:val="both"/>
+        <w:rPr>
+          <w:rFonts w:hint="default" w:ascii="Times New Roman" w:hAnsi="Times New Roman" w:cs="Times New Roman"/>
+          <w:sz w:val="24"/>
+          <w:szCs w:val="24"/>
+          <w:u w:val="none"/>
+          <w:lang w:val="el-GR"/>
+        </w:rPr>
+      </w:pPr>
+    </w:p>
+    <w:p>
+      <w:pPr>
+        <w:bidi w:val="0"/>
+        <w:jc w:val="both"/>
+        <w:rPr>
+          <w:rFonts w:hint="default" w:ascii="Times New Roman" w:hAnsi="Times New Roman" w:cs="Times New Roman"/>
+          <w:sz w:val="24"/>
+          <w:szCs w:val="24"/>
+          <w:u w:val="single"/>
+          <w:lang w:val="en-US"/>
+        </w:rPr>
+      </w:pPr>
+      <w:r>
+        <w:rPr>
+          <w:rFonts w:hint="default" w:ascii="Times New Roman" w:hAnsi="Times New Roman" w:cs="Times New Roman"/>
+          <w:sz w:val="24"/>
+          <w:szCs w:val="24"/>
+          <w:u w:val="single"/>
+          <w:lang w:val="en-US"/>
+        </w:rPr>
+        <w:t>Admin</w:t>
+      </w:r>
+    </w:p>
+    <w:p>
+      <w:pPr>
+        <w:bidi w:val="0"/>
+        <w:jc w:val="both"/>
+        <w:rPr>
+          <w:rFonts w:hint="default" w:ascii="Times New Roman" w:hAnsi="Times New Roman" w:cs="Times New Roman"/>
+          <w:sz w:val="24"/>
+          <w:szCs w:val="24"/>
+          <w:u w:val="none"/>
+          <w:lang w:val="en-US"/>
+        </w:rPr>
+      </w:pPr>
+      <w:r>
+        <w:rPr>
+          <w:rFonts w:hint="default" w:ascii="Times New Roman" w:hAnsi="Times New Roman" w:cs="Times New Roman"/>
+          <w:sz w:val="24"/>
+          <w:szCs w:val="24"/>
+          <w:u w:val="none"/>
+          <w:lang w:val="en-US"/>
+        </w:rPr>
+        <w:drawing>
+          <wp:inline distT="0" distB="0" distL="114300" distR="114300">
+            <wp:extent cx="5262245" cy="149860"/>
+            <wp:effectExtent l="0" t="0" r="14605" b="2540"/>
+            <wp:docPr id="11" name="Picture 11" descr="admin_menu"/>
+            <wp:cNvGraphicFramePr>
+              <a:graphicFrameLocks xmlns:a="http://schemas.openxmlformats.org/drawingml/2006/main" noChangeAspect="1"/>
+            </wp:cNvGraphicFramePr>
+            <a:graphic xmlns:a="http://schemas.openxmlformats.org/drawingml/2006/main">
+              <a:graphicData uri="http://schemas.openxmlformats.org/drawingml/2006/picture">
+                <pic:pic xmlns:pic="http://schemas.openxmlformats.org/drawingml/2006/picture">
+                  <pic:nvPicPr>
+                    <pic:cNvPr id="11" name="Picture 11" descr="admin_menu"/>
+                    <pic:cNvPicPr>
+                      <a:picLocks noChangeAspect="1"/>
+                    </pic:cNvPicPr>
+                  </pic:nvPicPr>
+                  <pic:blipFill>
+                    <a:blip r:embed="rId9"/>
+                    <a:stretch>
+                      <a:fillRect/>
+                    </a:stretch>
+                  </pic:blipFill>
+                  <pic:spPr>
+                    <a:xfrm>
+                      <a:off x="0" y="0"/>
+                      <a:ext cx="5262245" cy="149860"/>
+                    </a:xfrm>
+                    <a:prstGeom prst="rect">
+                      <a:avLst/>
+                    </a:prstGeom>
+                  </pic:spPr>
+                </pic:pic>
+              </a:graphicData>
+            </a:graphic>
+          </wp:inline>
+        </w:drawing>
+      </w:r>
+    </w:p>
+    <w:p>
+      <w:pPr>
+        <w:bidi w:val="0"/>
+        <w:jc w:val="both"/>
+        <w:rPr>
+          <w:rFonts w:hint="default" w:ascii="Times New Roman" w:hAnsi="Times New Roman" w:cs="Times New Roman"/>
+          <w:sz w:val="24"/>
+          <w:szCs w:val="24"/>
+          <w:u w:val="none"/>
+          <w:lang w:val="el-GR"/>
+        </w:rPr>
+      </w:pPr>
+      <w:r>
+        <w:rPr>
+          <w:rFonts w:hint="default" w:ascii="Times New Roman" w:hAnsi="Times New Roman" w:cs="Times New Roman"/>
+          <w:sz w:val="24"/>
+          <w:szCs w:val="24"/>
+          <w:u w:val="none"/>
+          <w:lang w:val="el-GR"/>
+        </w:rPr>
+        <w:t>Από αριστερά προς δεξιά:</w:t>
       </w:r>
       <w:bookmarkStart w:id="0" w:name="_GoBack"/>
       <w:bookmarkEnd w:id="0"/>
+    </w:p>
+    <w:p>
+      <w:pPr>
+        <w:pStyle w:val="3"/>
+        <w:bidi w:val="0"/>
+        <w:spacing w:line="240" w:lineRule="auto"/>
+        <w:jc w:val="both"/>
+        <w:rPr>
+          <w:rFonts w:hint="default" w:ascii="Times New Roman" w:hAnsi="Times New Roman" w:cs="Times New Roman"/>
+          <w:lang w:val="en-US"/>
+        </w:rPr>
+      </w:pPr>
+      <w:r>
+        <w:rPr>
+          <w:rFonts w:hint="default" w:ascii="Times New Roman" w:hAnsi="Times New Roman" w:cs="Times New Roman"/>
+          <w:lang w:val="el-GR"/>
+        </w:rPr>
+        <w:t xml:space="preserve">Φάκελος </w:t>
+      </w:r>
+      <w:r>
+        <w:rPr>
+          <w:rFonts w:hint="default" w:ascii="Times New Roman" w:hAnsi="Times New Roman" w:cs="Times New Roman"/>
+          <w:lang w:val="en-US"/>
+        </w:rPr>
+        <w:t>SPSSettings</w:t>
+      </w:r>
+    </w:p>
+    <w:p>
+      <w:pPr>
+        <w:jc w:val="both"/>
+        <w:rPr>
+          <w:rFonts w:hint="default" w:ascii="Times New Roman" w:hAnsi="Times New Roman" w:cs="Times New Roman"/>
+          <w:sz w:val="24"/>
+          <w:szCs w:val="24"/>
+          <w:lang w:val="el-GR"/>
+        </w:rPr>
+      </w:pPr>
+      <w:r>
+        <w:rPr>
+          <w:rFonts w:hint="default" w:ascii="Times New Roman" w:hAnsi="Times New Roman" w:cs="Times New Roman"/>
+          <w:sz w:val="24"/>
+          <w:szCs w:val="24"/>
+          <w:lang w:val="el-GR"/>
+        </w:rPr>
+        <w:t xml:space="preserve">Το αρχείο </w:t>
+      </w:r>
+      <w:r>
+        <w:rPr>
+          <w:rFonts w:hint="default" w:ascii="Times New Roman" w:hAnsi="Times New Roman" w:cs="Times New Roman"/>
+          <w:sz w:val="24"/>
+          <w:szCs w:val="24"/>
+          <w:lang w:val="en-US"/>
+        </w:rPr>
+        <w:t xml:space="preserve">settings </w:t>
+      </w:r>
+      <w:r>
+        <w:rPr>
+          <w:rFonts w:hint="default" w:ascii="Times New Roman" w:hAnsi="Times New Roman" w:cs="Times New Roman"/>
+          <w:sz w:val="24"/>
+          <w:szCs w:val="24"/>
+          <w:lang w:val="el-GR"/>
+        </w:rPr>
+        <w:t>περιέχει μερικές ρυθμίσεις του προγράμματος:</w:t>
+      </w:r>
+    </w:p>
+    <w:p>
+      <w:pPr>
+        <w:numPr>
+          <w:ilvl w:val="0"/>
+          <w:numId w:val="3"/>
+        </w:numPr>
+        <w:ind w:left="420" w:leftChars="0" w:hanging="420" w:firstLineChars="0"/>
+        <w:jc w:val="both"/>
+        <w:rPr>
+          <w:rFonts w:hint="default" w:ascii="Times New Roman" w:hAnsi="Times New Roman" w:cs="Times New Roman"/>
+          <w:sz w:val="24"/>
+          <w:szCs w:val="24"/>
+          <w:lang w:val="el-GR"/>
+        </w:rPr>
+      </w:pPr>
+      <w:r>
+        <w:rPr>
+          <w:rFonts w:hint="default" w:ascii="Times New Roman" w:hAnsi="Times New Roman" w:cs="Times New Roman"/>
+          <w:sz w:val="24"/>
+          <w:szCs w:val="24"/>
+          <w:lang w:val="en-US"/>
+        </w:rPr>
+        <w:t>maxLookupTableHours:</w:t>
+      </w:r>
+      <w:r>
+        <w:rPr>
+          <w:rFonts w:hint="default" w:ascii="Times New Roman" w:hAnsi="Times New Roman" w:cs="Times New Roman"/>
+          <w:sz w:val="24"/>
+          <w:szCs w:val="24"/>
+          <w:lang w:val="el-GR"/>
+        </w:rPr>
+        <w:t xml:space="preserve"> ο μέγιστος αριθμός ωρών για τη δημιουργία πινάκων επισκευών ([30000-100000] συμπεριλαμβανομένων και των άκρων, προεπιλογή 50000).</w:t>
+      </w:r>
+    </w:p>
+    <w:p>
+      <w:pPr>
+        <w:numPr>
+          <w:ilvl w:val="0"/>
+          <w:numId w:val="3"/>
+        </w:numPr>
+        <w:ind w:left="420" w:leftChars="0" w:hanging="420" w:firstLineChars="0"/>
+        <w:jc w:val="both"/>
+        <w:rPr>
+          <w:rFonts w:hint="default" w:ascii="Times New Roman" w:hAnsi="Times New Roman" w:cs="Times New Roman"/>
+          <w:sz w:val="24"/>
+          <w:szCs w:val="24"/>
+          <w:lang w:val="el-GR"/>
+        </w:rPr>
+      </w:pPr>
+      <w:r>
+        <w:rPr>
+          <w:rFonts w:hint="default" w:ascii="Times New Roman" w:hAnsi="Times New Roman" w:cs="Times New Roman"/>
+          <w:sz w:val="24"/>
+          <w:szCs w:val="24"/>
+          <w:lang w:val="en-US"/>
+        </w:rPr>
+        <w:t xml:space="preserve">maxLookupTableDays: </w:t>
+      </w:r>
+      <w:r>
+        <w:rPr>
+          <w:rFonts w:hint="default" w:ascii="Times New Roman" w:hAnsi="Times New Roman" w:cs="Times New Roman"/>
+          <w:sz w:val="24"/>
+          <w:szCs w:val="24"/>
+          <w:lang w:val="el-GR"/>
+        </w:rPr>
+        <w:t>ο μέγιστος αριθμός ημερών για τη δημιουργία πινάκων επισκευών ([5000-20000] συμπεριλαμβανομένων και των άκρων, προεπιλογή 10000).</w:t>
+      </w:r>
+    </w:p>
+    <w:p>
+      <w:pPr>
+        <w:numPr>
+          <w:ilvl w:val="0"/>
+          <w:numId w:val="3"/>
+        </w:numPr>
+        <w:ind w:left="420" w:leftChars="0" w:hanging="420" w:firstLineChars="0"/>
+        <w:jc w:val="both"/>
+        <w:rPr>
+          <w:rFonts w:hint="default" w:ascii="Times New Roman" w:hAnsi="Times New Roman" w:cs="Times New Roman"/>
+          <w:sz w:val="24"/>
+          <w:szCs w:val="24"/>
+          <w:lang w:val="el-GR"/>
+        </w:rPr>
+      </w:pPr>
+      <w:r>
+        <w:rPr>
+          <w:rFonts w:hint="default" w:ascii="Times New Roman" w:hAnsi="Times New Roman" w:cs="Times New Roman"/>
+          <w:sz w:val="24"/>
+          <w:szCs w:val="24"/>
+          <w:lang w:val="en-US"/>
+        </w:rPr>
+        <w:t xml:space="preserve">badgeName: </w:t>
+      </w:r>
+      <w:r>
+        <w:rPr>
+          <w:rFonts w:hint="default" w:ascii="Times New Roman" w:hAnsi="Times New Roman" w:cs="Times New Roman"/>
+          <w:sz w:val="24"/>
+          <w:szCs w:val="24"/>
+          <w:lang w:val="el-GR"/>
+        </w:rPr>
+        <w:t>όνομα εικόνας που θα εμφανίζεται στην κάτω αριστερή γωνία του προγράμματος. Ο χρήστης μπορεί να αλλάξει την εικόνα, αρκεί να αλλάξει και αυτή την τιμή στο όνομα της εικόνας.</w:t>
+      </w:r>
+    </w:p>
+    <w:p>
+      <w:pPr>
+        <w:numPr>
+          <w:ilvl w:val="0"/>
+          <w:numId w:val="3"/>
+        </w:numPr>
+        <w:ind w:left="420" w:leftChars="0" w:hanging="420" w:firstLineChars="0"/>
+        <w:jc w:val="both"/>
+        <w:rPr>
+          <w:rFonts w:hint="default" w:ascii="Times New Roman" w:hAnsi="Times New Roman" w:cs="Times New Roman"/>
+          <w:sz w:val="24"/>
+          <w:szCs w:val="24"/>
+          <w:lang w:val="el-GR"/>
+        </w:rPr>
+      </w:pPr>
+      <w:r>
+        <w:rPr>
+          <w:rFonts w:hint="default" w:ascii="Times New Roman" w:hAnsi="Times New Roman" w:cs="Times New Roman"/>
+          <w:sz w:val="24"/>
+          <w:szCs w:val="24"/>
+          <w:lang w:val="en-US"/>
+        </w:rPr>
+        <w:t xml:space="preserve">FullPath: </w:t>
+      </w:r>
+      <w:r>
+        <w:rPr>
+          <w:rFonts w:hint="default" w:ascii="Times New Roman" w:hAnsi="Times New Roman" w:cs="Times New Roman"/>
+          <w:sz w:val="24"/>
+          <w:szCs w:val="24"/>
+          <w:lang w:val="el-GR"/>
+        </w:rPr>
+        <w:t>η πλήρης τοποθεσία(διεύθυνση)</w:t>
+      </w:r>
+      <w:r>
+        <w:rPr>
+          <w:rFonts w:hint="default" w:ascii="Times New Roman" w:hAnsi="Times New Roman" w:cs="Times New Roman"/>
+          <w:sz w:val="24"/>
+          <w:szCs w:val="24"/>
+          <w:lang w:val="en-US"/>
+        </w:rPr>
+        <w:t xml:space="preserve"> </w:t>
+      </w:r>
+      <w:r>
+        <w:rPr>
+          <w:rFonts w:hint="default" w:ascii="Times New Roman" w:hAnsi="Times New Roman" w:cs="Times New Roman"/>
+          <w:sz w:val="24"/>
+          <w:szCs w:val="24"/>
+          <w:lang w:val="el-GR"/>
+        </w:rPr>
+        <w:t>όπου βρίσκεται η παραπάνω εικόνα.</w:t>
+      </w:r>
+    </w:p>
+    <w:p>
+      <w:pPr>
+        <w:numPr>
+          <w:ilvl w:val="0"/>
+          <w:numId w:val="3"/>
+        </w:numPr>
+        <w:ind w:left="420" w:leftChars="0" w:hanging="420" w:firstLineChars="0"/>
+        <w:jc w:val="both"/>
+        <w:rPr>
+          <w:rFonts w:hint="default" w:ascii="Times New Roman" w:hAnsi="Times New Roman" w:cs="Times New Roman"/>
+          <w:sz w:val="24"/>
+          <w:szCs w:val="24"/>
+          <w:lang w:val="el-GR"/>
+        </w:rPr>
+      </w:pPr>
+      <w:r>
+        <w:rPr>
+          <w:rFonts w:hint="default" w:ascii="Times New Roman" w:hAnsi="Times New Roman" w:cs="Times New Roman"/>
+          <w:sz w:val="24"/>
+          <w:szCs w:val="24"/>
+          <w:lang w:val="el-GR"/>
+        </w:rPr>
+        <w:t>.....</w:t>
+      </w:r>
+    </w:p>
+    <w:p>
+      <w:pPr>
+        <w:numPr>
+          <w:numId w:val="0"/>
+        </w:numPr>
+        <w:jc w:val="both"/>
+        <w:rPr>
+          <w:rFonts w:hint="default" w:ascii="Times New Roman" w:hAnsi="Times New Roman" w:cs="Times New Roman"/>
+          <w:sz w:val="24"/>
+          <w:szCs w:val="24"/>
+          <w:lang w:val="en-US"/>
+        </w:rPr>
+      </w:pPr>
+    </w:p>
+    <w:p>
+      <w:pPr>
+        <w:numPr>
+          <w:numId w:val="0"/>
+        </w:numPr>
+        <w:jc w:val="both"/>
+        <w:rPr>
+          <w:rFonts w:hint="default" w:ascii="Times New Roman" w:hAnsi="Times New Roman" w:cs="Times New Roman"/>
+          <w:sz w:val="24"/>
+          <w:szCs w:val="24"/>
+          <w:lang w:val="el-GR"/>
+        </w:rPr>
+      </w:pPr>
+    </w:p>
+    <w:p>
+      <w:pPr>
+        <w:numPr>
+          <w:numId w:val="0"/>
+        </w:numPr>
+        <w:jc w:val="both"/>
+        <w:rPr>
+          <w:rFonts w:hint="default" w:ascii="Times New Roman" w:hAnsi="Times New Roman" w:cs="Times New Roman"/>
+          <w:sz w:val="24"/>
+          <w:szCs w:val="24"/>
+          <w:lang w:val="en-US"/>
+        </w:rPr>
+      </w:pPr>
     </w:p>
     <w:sectPr>
       <w:pgSz w:w="11906" w:h="16838"/>
@@ -27,6 +1174,80 @@
     </w:sectPr>
   </w:body>
 </w:document>
+</file>
+
+<file path=word/numbering.xml><?xml version="1.0" encoding="utf-8"?>
+<w:numbering xmlns:wpc="http://schemas.microsoft.com/office/word/2010/wordprocessingCanvas" xmlns:mc="http://schemas.openxmlformats.org/markup-compatibility/2006" xmlns:o="urn:schemas-microsoft-com:office:office" xmlns:r="http://schemas.openxmlformats.org/officeDocument/2006/relationships" xmlns:m="http://schemas.openxmlformats.org/officeDocument/2006/math" xmlns:v="urn:schemas-microsoft-com:vml" xmlns:wp14="http://schemas.microsoft.com/office/word/2010/wordprocessingDrawing" xmlns:wp="http://schemas.openxmlformats.org/drawingml/2006/wordprocessingDrawing" xmlns:w10="urn:schemas-microsoft-com:office:word" xmlns:w="http://schemas.openxmlformats.org/wordprocessingml/2006/main" xmlns:w14="http://schemas.microsoft.com/office/word/2010/wordml" xmlns:wpg="http://schemas.microsoft.com/office/word/2010/wordprocessingGroup" xmlns:wpi="http://schemas.microsoft.com/office/word/2010/wordprocessingInk" xmlns:wne="http://schemas.microsoft.com/office/word/2006/wordml" xmlns:wps="http://schemas.microsoft.com/office/word/2010/wordprocessingShape" xmlns:wpsCustomData="http://www.wps.cn/officeDocument/2013/wpsCustomData" mc:Ignorable="w14 wp14">
+  <w:abstractNum w:abstractNumId="0">
+    <w:nsid w:val="5D950FE1"/>
+    <w:multiLevelType w:val="singleLevel"/>
+    <w:tmpl w:val="5D950FE1"/>
+    <w:lvl w:ilvl="0" w:tentative="0">
+      <w:start w:val="1"/>
+      <w:numFmt w:val="decimal"/>
+      <w:lvlText w:val="%1."/>
+      <w:lvlJc w:val="left"/>
+      <w:pPr>
+        <w:tabs>
+          <w:tab w:val="left" w:pos="425"/>
+        </w:tabs>
+        <w:ind w:left="425" w:leftChars="0" w:hanging="425" w:firstLineChars="0"/>
+      </w:pPr>
+      <w:rPr>
+        <w:rFonts w:hint="default"/>
+      </w:rPr>
+    </w:lvl>
+  </w:abstractNum>
+  <w:abstractNum w:abstractNumId="1">
+    <w:nsid w:val="6AABAE44"/>
+    <w:multiLevelType w:val="singleLevel"/>
+    <w:tmpl w:val="6AABAE44"/>
+    <w:lvl w:ilvl="0" w:tentative="0">
+      <w:start w:val="1"/>
+      <w:numFmt w:val="bullet"/>
+      <w:lvlText w:val=""/>
+      <w:lvlJc w:val="left"/>
+      <w:pPr>
+        <w:tabs>
+          <w:tab w:val="left" w:pos="420"/>
+        </w:tabs>
+        <w:ind w:left="420" w:leftChars="0" w:hanging="420" w:firstLineChars="0"/>
+      </w:pPr>
+      <w:rPr>
+        <w:rFonts w:hint="default" w:ascii="Wingdings" w:hAnsi="Wingdings"/>
+      </w:rPr>
+    </w:lvl>
+  </w:abstractNum>
+  <w:abstractNum w:abstractNumId="2">
+    <w:nsid w:val="78E1DD06"/>
+    <w:multiLevelType w:val="singleLevel"/>
+    <w:tmpl w:val="78E1DD06"/>
+    <w:lvl w:ilvl="0" w:tentative="0">
+      <w:start w:val="1"/>
+      <w:numFmt w:val="bullet"/>
+      <w:lvlText w:val=""/>
+      <w:lvlJc w:val="left"/>
+      <w:pPr>
+        <w:tabs>
+          <w:tab w:val="left" w:pos="420"/>
+        </w:tabs>
+        <w:ind w:left="420" w:leftChars="0" w:hanging="420" w:firstLineChars="0"/>
+      </w:pPr>
+      <w:rPr>
+        <w:rFonts w:hint="default" w:ascii="Wingdings" w:hAnsi="Wingdings"/>
+      </w:rPr>
+    </w:lvl>
+  </w:abstractNum>
+  <w:num w:numId="1">
+    <w:abstractNumId w:val="1"/>
+  </w:num>
+  <w:num w:numId="2">
+    <w:abstractNumId w:val="0"/>
+  </w:num>
+  <w:num w:numId="3">
+    <w:abstractNumId w:val="2"/>
+  </w:num>
+</w:numbering>
 </file>
 
 <file path=word/styles.xml><?xml version="1.0" encoding="utf-8"?>
@@ -42,8 +1263,8 @@
   <w:latentStyles w:count="260" w:defQFormat="0" w:defUnhideWhenUsed="1" w:defSemiHidden="1" w:defUIPriority="99" w:defLockedState="0">
     <w:lsdException w:qFormat="1" w:unhideWhenUsed="0" w:uiPriority="0" w:semiHidden="0" w:name="Normal"/>
     <w:lsdException w:qFormat="1" w:unhideWhenUsed="0" w:uiPriority="0" w:semiHidden="0" w:name="heading 1"/>
-    <w:lsdException w:qFormat="1" w:uiPriority="0" w:name="heading 2"/>
-    <w:lsdException w:qFormat="1" w:uiPriority="0" w:name="heading 3"/>
+    <w:lsdException w:qFormat="1" w:uiPriority="0" w:semiHidden="0" w:name="heading 2"/>
+    <w:lsdException w:qFormat="1" w:uiPriority="0" w:semiHidden="0" w:name="heading 3"/>
     <w:lsdException w:qFormat="1" w:uiPriority="0" w:name="heading 4"/>
     <w:lsdException w:qFormat="1" w:uiPriority="0" w:name="heading 5"/>
     <w:lsdException w:qFormat="1" w:uiPriority="0" w:name="heading 6"/>
@@ -298,12 +1519,72 @@
       <w:lang w:val="en-US" w:eastAsia="zh-CN" w:bidi="ar-SA"/>
     </w:rPr>
   </w:style>
-  <w:style w:type="character" w:default="1" w:styleId="2">
+  <w:style w:type="paragraph" w:styleId="2">
+    <w:name w:val="heading 1"/>
+    <w:basedOn w:val="1"/>
+    <w:next w:val="1"/>
+    <w:qFormat/>
+    <w:uiPriority w:val="0"/>
+    <w:pPr>
+      <w:keepNext/>
+      <w:keepLines/>
+      <w:spacing w:before="340" w:after="330" w:line="578" w:lineRule="auto"/>
+      <w:outlineLvl w:val="0"/>
+    </w:pPr>
+    <w:rPr>
+      <w:b/>
+      <w:bCs/>
+      <w:kern w:val="44"/>
+      <w:sz w:val="44"/>
+      <w:szCs w:val="44"/>
+    </w:rPr>
+  </w:style>
+  <w:style w:type="paragraph" w:styleId="3">
+    <w:name w:val="heading 2"/>
+    <w:basedOn w:val="1"/>
+    <w:next w:val="1"/>
+    <w:unhideWhenUsed/>
+    <w:qFormat/>
+    <w:uiPriority w:val="0"/>
+    <w:pPr>
+      <w:keepNext/>
+      <w:keepLines/>
+      <w:spacing w:before="260" w:after="260" w:line="416" w:lineRule="auto"/>
+      <w:outlineLvl w:val="1"/>
+    </w:pPr>
+    <w:rPr>
+      <w:b/>
+      <w:bCs/>
+      <w:sz w:val="32"/>
+      <w:szCs w:val="32"/>
+    </w:rPr>
+  </w:style>
+  <w:style w:type="paragraph" w:styleId="4">
+    <w:name w:val="heading 3"/>
+    <w:basedOn w:val="1"/>
+    <w:next w:val="1"/>
+    <w:unhideWhenUsed/>
+    <w:qFormat/>
+    <w:uiPriority w:val="0"/>
+    <w:pPr>
+      <w:keepNext/>
+      <w:keepLines/>
+      <w:spacing w:before="260" w:after="260" w:line="416" w:lineRule="auto"/>
+      <w:outlineLvl w:val="2"/>
+    </w:pPr>
+    <w:rPr>
+      <w:b/>
+      <w:bCs/>
+      <w:sz w:val="32"/>
+      <w:szCs w:val="32"/>
+    </w:rPr>
+  </w:style>
+  <w:style w:type="character" w:default="1" w:styleId="5">
     <w:name w:val="Default Paragraph Font"/>
     <w:semiHidden/>
     <w:uiPriority w:val="0"/>
   </w:style>
-  <w:style w:type="table" w:default="1" w:styleId="3">
+  <w:style w:type="table" w:default="1" w:styleId="6">
     <w:name w:val="Normal Table"/>
     <w:semiHidden/>
     <w:uiPriority w:val="0"/>

</xml_diff>

<commit_message>
bugfix regarding message box buttons
</commit_message>
<xml_diff>
--- a/Assets/User Manual/UserManual.docx
+++ b/Assets/User Manual/UserManual.docx
@@ -437,6 +437,7 @@
     <w:p>
       <w:pPr>
         <w:numPr>
+          <w:ilvl w:val="0"/>
           <w:numId w:val="0"/>
         </w:numPr>
         <w:jc w:val="both"/>
@@ -451,6 +452,7 @@
     <w:p>
       <w:pPr>
         <w:numPr>
+          <w:ilvl w:val="0"/>
           <w:numId w:val="0"/>
         </w:numPr>
         <w:jc w:val="both"/>
@@ -465,6 +467,7 @@
     <w:p>
       <w:pPr>
         <w:numPr>
+          <w:ilvl w:val="0"/>
           <w:numId w:val="0"/>
         </w:numPr>
         <w:jc w:val="both"/>
@@ -599,6 +602,107 @@
     <w:p>
       <w:pPr>
         <w:numPr>
+          <w:numId w:val="0"/>
+        </w:numPr>
+        <w:tabs>
+          <w:tab w:val="left" w:pos="425"/>
+        </w:tabs>
+        <w:jc w:val="center"/>
+      </w:pPr>
+      <w:r>
+        <w:drawing>
+          <wp:inline distT="0" distB="0" distL="114300" distR="114300">
+            <wp:extent cx="3086100" cy="2476500"/>
+            <wp:effectExtent l="0" t="0" r="0" b="0"/>
+            <wp:docPr id="1" name="Picture 1"/>
+            <wp:cNvGraphicFramePr>
+              <a:graphicFrameLocks xmlns:a="http://schemas.openxmlformats.org/drawingml/2006/main" noChangeAspect="1"/>
+            </wp:cNvGraphicFramePr>
+            <a:graphic xmlns:a="http://schemas.openxmlformats.org/drawingml/2006/main">
+              <a:graphicData uri="http://schemas.openxmlformats.org/drawingml/2006/picture">
+                <pic:pic xmlns:pic="http://schemas.openxmlformats.org/drawingml/2006/picture">
+                  <pic:nvPicPr>
+                    <pic:cNvPr id="1" name="Picture 1"/>
+                    <pic:cNvPicPr>
+                      <a:picLocks noChangeAspect="1"/>
+                    </pic:cNvPicPr>
+                  </pic:nvPicPr>
+                  <pic:blipFill>
+                    <a:blip r:embed="rId8"/>
+                    <a:stretch>
+                      <a:fillRect/>
+                    </a:stretch>
+                  </pic:blipFill>
+                  <pic:spPr>
+                    <a:xfrm>
+                      <a:off x="0" y="0"/>
+                      <a:ext cx="3086100" cy="2476500"/>
+                    </a:xfrm>
+                    <a:prstGeom prst="rect">
+                      <a:avLst/>
+                    </a:prstGeom>
+                    <a:noFill/>
+                    <a:ln>
+                      <a:noFill/>
+                    </a:ln>
+                  </pic:spPr>
+                </pic:pic>
+              </a:graphicData>
+            </a:graphic>
+          </wp:inline>
+        </w:drawing>
+      </w:r>
+    </w:p>
+    <w:p>
+      <w:pPr>
+        <w:numPr>
+          <w:numId w:val="0"/>
+        </w:numPr>
+        <w:tabs>
+          <w:tab w:val="left" w:pos="425"/>
+        </w:tabs>
+        <w:jc w:val="both"/>
+        <w:rPr>
+          <w:rFonts w:hint="default" w:ascii="Times New Roman" w:hAnsi="Times New Roman" w:cs="Times New Roman"/>
+          <w:sz w:val="24"/>
+          <w:szCs w:val="24"/>
+          <w:lang w:val="el-GR"/>
+        </w:rPr>
+      </w:pPr>
+      <w:r>
+        <w:rPr>
+          <w:rFonts w:hint="default" w:ascii="Times New Roman" w:hAnsi="Times New Roman" w:cs="Times New Roman"/>
+          <w:sz w:val="24"/>
+          <w:szCs w:val="24"/>
+          <w:lang w:val="el-GR"/>
+        </w:rPr>
+        <w:t>Ο χρήστης μπορεί να συνδεθεί με τον παραπάνω διάλογο, συμπληρώνοντας τα στοιχεία ενός από τους 3 λογαριασμούς.</w:t>
+      </w:r>
+      <w:r>
+        <w:rPr>
+          <w:rFonts w:hint="default" w:ascii="Times New Roman" w:hAnsi="Times New Roman" w:cs="Times New Roman"/>
+          <w:sz w:val="24"/>
+          <w:szCs w:val="24"/>
+          <w:lang w:val="en-US"/>
+        </w:rPr>
+        <w:t xml:space="preserve"> </w:t>
+      </w:r>
+      <w:r>
+        <w:rPr>
+          <w:rFonts w:hint="default" w:ascii="Times New Roman" w:hAnsi="Times New Roman" w:cs="Times New Roman"/>
+          <w:sz w:val="24"/>
+          <w:szCs w:val="24"/>
+          <w:lang w:val="el-GR"/>
+        </w:rPr>
+        <w:t>Τα προεπιλεγμένα στοιχεία λογαριασμών βρίσκονται στο κεφάλαιο ().</w:t>
+      </w:r>
+      <w:bookmarkStart w:id="0" w:name="_GoBack"/>
+      <w:bookmarkEnd w:id="0"/>
+    </w:p>
+    <w:p>
+      <w:pPr>
+        <w:numPr>
+          <w:ilvl w:val="0"/>
           <w:numId w:val="0"/>
         </w:numPr>
         <w:jc w:val="both"/>
@@ -717,7 +821,7 @@
                     </pic:cNvPicPr>
                   </pic:nvPicPr>
                   <pic:blipFill>
-                    <a:blip r:embed="rId8"/>
+                    <a:blip r:embed="rId9"/>
                     <a:stretch>
                       <a:fillRect/>
                     </a:stretch>
@@ -763,6 +867,146 @@
     </w:p>
     <w:p>
       <w:pPr>
+        <w:numPr>
+          <w:ilvl w:val="0"/>
+          <w:numId w:val="3"/>
+        </w:numPr>
+        <w:bidi w:val="0"/>
+        <w:ind w:left="420" w:leftChars="0" w:hanging="420" w:firstLineChars="0"/>
+        <w:jc w:val="both"/>
+        <w:rPr>
+          <w:rFonts w:hint="default" w:ascii="Times New Roman" w:hAnsi="Times New Roman" w:cs="Times New Roman"/>
+          <w:sz w:val="24"/>
+          <w:szCs w:val="24"/>
+          <w:u w:val="none"/>
+          <w:lang w:val="el-GR"/>
+        </w:rPr>
+      </w:pPr>
+      <w:r>
+        <w:rPr>
+          <w:rFonts w:hint="default" w:ascii="Times New Roman" w:hAnsi="Times New Roman" w:cs="Times New Roman"/>
+          <w:sz w:val="24"/>
+          <w:szCs w:val="24"/>
+          <w:u w:val="none"/>
+          <w:lang w:val="el-GR"/>
+        </w:rPr>
+        <w:t>Επιλογή επιστασίας</w:t>
+      </w:r>
+    </w:p>
+    <w:p>
+      <w:pPr>
+        <w:numPr>
+          <w:ilvl w:val="0"/>
+          <w:numId w:val="3"/>
+        </w:numPr>
+        <w:bidi w:val="0"/>
+        <w:ind w:left="420" w:leftChars="0" w:hanging="420" w:firstLineChars="0"/>
+        <w:jc w:val="both"/>
+        <w:rPr>
+          <w:rFonts w:hint="default" w:ascii="Times New Roman" w:hAnsi="Times New Roman" w:cs="Times New Roman"/>
+          <w:sz w:val="24"/>
+          <w:szCs w:val="24"/>
+          <w:u w:val="none"/>
+          <w:lang w:val="el-GR"/>
+        </w:rPr>
+      </w:pPr>
+      <w:r>
+        <w:rPr>
+          <w:rFonts w:hint="default" w:ascii="Times New Roman" w:hAnsi="Times New Roman" w:cs="Times New Roman"/>
+          <w:sz w:val="24"/>
+          <w:szCs w:val="24"/>
+          <w:u w:val="none"/>
+          <w:lang w:val="el-GR"/>
+        </w:rPr>
+        <w:t>Έλεγχος για επισκευές</w:t>
+      </w:r>
+    </w:p>
+    <w:p>
+      <w:pPr>
+        <w:numPr>
+          <w:ilvl w:val="0"/>
+          <w:numId w:val="3"/>
+        </w:numPr>
+        <w:bidi w:val="0"/>
+        <w:ind w:left="420" w:leftChars="0" w:hanging="420" w:firstLineChars="0"/>
+        <w:jc w:val="both"/>
+        <w:rPr>
+          <w:rFonts w:hint="default" w:ascii="Times New Roman" w:hAnsi="Times New Roman" w:cs="Times New Roman"/>
+          <w:sz w:val="24"/>
+          <w:szCs w:val="24"/>
+          <w:u w:val="none"/>
+          <w:lang w:val="el-GR"/>
+        </w:rPr>
+      </w:pPr>
+      <w:r>
+        <w:rPr>
+          <w:rFonts w:hint="default" w:ascii="Times New Roman" w:hAnsi="Times New Roman" w:cs="Times New Roman"/>
+          <w:sz w:val="24"/>
+          <w:szCs w:val="24"/>
+          <w:u w:val="none"/>
+          <w:lang w:val="el-GR"/>
+        </w:rPr>
+        <w:t>Εισαγωγή/Εξαγωγή βάσης δεδομένων</w:t>
+      </w:r>
+    </w:p>
+    <w:p>
+      <w:pPr>
+        <w:numPr>
+          <w:ilvl w:val="0"/>
+          <w:numId w:val="3"/>
+        </w:numPr>
+        <w:bidi w:val="0"/>
+        <w:ind w:left="420" w:leftChars="0" w:hanging="420" w:firstLineChars="0"/>
+        <w:jc w:val="both"/>
+        <w:rPr>
+          <w:rFonts w:hint="default" w:ascii="Times New Roman" w:hAnsi="Times New Roman" w:cs="Times New Roman"/>
+          <w:sz w:val="24"/>
+          <w:szCs w:val="24"/>
+          <w:u w:val="none"/>
+          <w:lang w:val="el-GR"/>
+        </w:rPr>
+      </w:pPr>
+      <w:r>
+        <w:rPr>
+          <w:rFonts w:hint="default" w:ascii="Times New Roman" w:hAnsi="Times New Roman" w:cs="Times New Roman"/>
+          <w:sz w:val="24"/>
+          <w:szCs w:val="24"/>
+          <w:u w:val="none"/>
+          <w:lang w:val="el-GR"/>
+        </w:rPr>
+        <w:t>Αλλαγή κωδικού πρόσβασης</w:t>
+      </w:r>
+    </w:p>
+    <w:p>
+      <w:pPr>
+        <w:numPr>
+          <w:ilvl w:val="0"/>
+          <w:numId w:val="3"/>
+        </w:numPr>
+        <w:bidi w:val="0"/>
+        <w:ind w:left="420" w:leftChars="0" w:hanging="420" w:firstLineChars="0"/>
+        <w:jc w:val="both"/>
+        <w:rPr>
+          <w:rFonts w:hint="default" w:ascii="Times New Roman" w:hAnsi="Times New Roman" w:cs="Times New Roman"/>
+          <w:sz w:val="24"/>
+          <w:szCs w:val="24"/>
+          <w:u w:val="none"/>
+          <w:lang w:val="el-GR"/>
+        </w:rPr>
+      </w:pPr>
+      <w:r>
+        <w:rPr>
+          <w:rFonts w:hint="default" w:ascii="Times New Roman" w:hAnsi="Times New Roman" w:cs="Times New Roman"/>
+          <w:sz w:val="24"/>
+          <w:szCs w:val="24"/>
+          <w:u w:val="none"/>
+          <w:lang w:val="el-GR"/>
+        </w:rPr>
+        <w:t>Έξοδος χρήστη</w:t>
+      </w:r>
+    </w:p>
+    <w:p>
+      <w:pPr>
         <w:bidi w:val="0"/>
         <w:jc w:val="both"/>
         <w:rPr>
@@ -835,7 +1079,7 @@
                     </pic:cNvPicPr>
                   </pic:nvPicPr>
                   <pic:blipFill>
-                    <a:blip r:embed="rId9"/>
+                    <a:blip r:embed="rId10"/>
                     <a:stretch>
                       <a:fillRect/>
                     </a:stretch>
@@ -878,8 +1122,230 @@
         </w:rPr>
         <w:t>Από αριστερά προς δεξιά:</w:t>
       </w:r>
-      <w:bookmarkStart w:id="0" w:name="_GoBack"/>
-      <w:bookmarkEnd w:id="0"/>
+    </w:p>
+    <w:p>
+      <w:pPr>
+        <w:numPr>
+          <w:ilvl w:val="0"/>
+          <w:numId w:val="3"/>
+        </w:numPr>
+        <w:bidi w:val="0"/>
+        <w:ind w:left="420" w:leftChars="0" w:hanging="420" w:firstLineChars="0"/>
+        <w:jc w:val="both"/>
+        <w:rPr>
+          <w:rFonts w:hint="default" w:ascii="Times New Roman" w:hAnsi="Times New Roman" w:cs="Times New Roman"/>
+          <w:sz w:val="24"/>
+          <w:szCs w:val="24"/>
+          <w:u w:val="none"/>
+          <w:lang w:val="el-GR"/>
+        </w:rPr>
+      </w:pPr>
+      <w:r>
+        <w:rPr>
+          <w:rFonts w:hint="default" w:ascii="Times New Roman" w:hAnsi="Times New Roman" w:cs="Times New Roman"/>
+          <w:sz w:val="24"/>
+          <w:szCs w:val="24"/>
+          <w:u w:val="none"/>
+          <w:lang w:val="el-GR"/>
+        </w:rPr>
+        <w:t>Προσθήκη επιστασίας</w:t>
+      </w:r>
+    </w:p>
+    <w:p>
+      <w:pPr>
+        <w:numPr>
+          <w:ilvl w:val="0"/>
+          <w:numId w:val="3"/>
+        </w:numPr>
+        <w:bidi w:val="0"/>
+        <w:ind w:left="420" w:leftChars="0" w:hanging="420" w:firstLineChars="0"/>
+        <w:jc w:val="both"/>
+        <w:rPr>
+          <w:rFonts w:hint="default" w:ascii="Times New Roman" w:hAnsi="Times New Roman" w:cs="Times New Roman"/>
+          <w:sz w:val="24"/>
+          <w:szCs w:val="24"/>
+          <w:u w:val="none"/>
+          <w:lang w:val="el-GR"/>
+        </w:rPr>
+      </w:pPr>
+      <w:r>
+        <w:rPr>
+          <w:rFonts w:hint="default" w:ascii="Times New Roman" w:hAnsi="Times New Roman" w:cs="Times New Roman"/>
+          <w:sz w:val="24"/>
+          <w:szCs w:val="24"/>
+          <w:u w:val="none"/>
+          <w:lang w:val="el-GR"/>
+        </w:rPr>
+        <w:t>Προσθήκη συστήματος</w:t>
+      </w:r>
+    </w:p>
+    <w:p>
+      <w:pPr>
+        <w:numPr>
+          <w:ilvl w:val="0"/>
+          <w:numId w:val="3"/>
+        </w:numPr>
+        <w:bidi w:val="0"/>
+        <w:ind w:left="420" w:leftChars="0" w:hanging="420" w:firstLineChars="0"/>
+        <w:jc w:val="both"/>
+        <w:rPr>
+          <w:rFonts w:hint="default" w:ascii="Times New Roman" w:hAnsi="Times New Roman" w:cs="Times New Roman"/>
+          <w:sz w:val="24"/>
+          <w:szCs w:val="24"/>
+          <w:u w:val="none"/>
+          <w:lang w:val="el-GR"/>
+        </w:rPr>
+      </w:pPr>
+      <w:r>
+        <w:rPr>
+          <w:rFonts w:hint="default" w:ascii="Times New Roman" w:hAnsi="Times New Roman" w:cs="Times New Roman"/>
+          <w:sz w:val="24"/>
+          <w:szCs w:val="24"/>
+          <w:u w:val="none"/>
+          <w:lang w:val="el-GR"/>
+        </w:rPr>
+        <w:t>Επιλογή Επιστασίας</w:t>
+      </w:r>
+    </w:p>
+    <w:p>
+      <w:pPr>
+        <w:numPr>
+          <w:ilvl w:val="0"/>
+          <w:numId w:val="3"/>
+        </w:numPr>
+        <w:bidi w:val="0"/>
+        <w:ind w:left="420" w:leftChars="0" w:hanging="420" w:firstLineChars="0"/>
+        <w:jc w:val="both"/>
+        <w:rPr>
+          <w:rFonts w:hint="default" w:ascii="Times New Roman" w:hAnsi="Times New Roman" w:cs="Times New Roman"/>
+          <w:sz w:val="24"/>
+          <w:szCs w:val="24"/>
+          <w:u w:val="none"/>
+          <w:lang w:val="el-GR"/>
+        </w:rPr>
+      </w:pPr>
+      <w:r>
+        <w:rPr>
+          <w:rFonts w:hint="default" w:ascii="Times New Roman" w:hAnsi="Times New Roman" w:cs="Times New Roman"/>
+          <w:sz w:val="24"/>
+          <w:szCs w:val="24"/>
+          <w:u w:val="none"/>
+          <w:lang w:val="el-GR"/>
+        </w:rPr>
+        <w:t>Έλεγχος για επισκευές</w:t>
+      </w:r>
+    </w:p>
+    <w:p>
+      <w:pPr>
+        <w:numPr>
+          <w:ilvl w:val="0"/>
+          <w:numId w:val="3"/>
+        </w:numPr>
+        <w:bidi w:val="0"/>
+        <w:ind w:left="420" w:leftChars="0" w:hanging="420" w:firstLineChars="0"/>
+        <w:jc w:val="both"/>
+        <w:rPr>
+          <w:rFonts w:hint="default" w:ascii="Times New Roman" w:hAnsi="Times New Roman" w:cs="Times New Roman"/>
+          <w:sz w:val="24"/>
+          <w:szCs w:val="24"/>
+          <w:u w:val="none"/>
+          <w:lang w:val="el-GR"/>
+        </w:rPr>
+      </w:pPr>
+      <w:r>
+        <w:rPr>
+          <w:rFonts w:hint="default" w:ascii="Times New Roman" w:hAnsi="Times New Roman" w:cs="Times New Roman"/>
+          <w:sz w:val="24"/>
+          <w:szCs w:val="24"/>
+          <w:u w:val="none"/>
+          <w:lang w:val="el-GR"/>
+        </w:rPr>
+        <w:t>Προσθήκη μηχανήματος</w:t>
+      </w:r>
+    </w:p>
+    <w:p>
+      <w:pPr>
+        <w:numPr>
+          <w:ilvl w:val="0"/>
+          <w:numId w:val="3"/>
+        </w:numPr>
+        <w:bidi w:val="0"/>
+        <w:ind w:left="420" w:leftChars="0" w:hanging="420" w:firstLineChars="0"/>
+        <w:jc w:val="both"/>
+        <w:rPr>
+          <w:rFonts w:hint="default" w:ascii="Times New Roman" w:hAnsi="Times New Roman" w:cs="Times New Roman"/>
+          <w:sz w:val="24"/>
+          <w:szCs w:val="24"/>
+          <w:u w:val="none"/>
+          <w:lang w:val="el-GR"/>
+        </w:rPr>
+      </w:pPr>
+      <w:r>
+        <w:rPr>
+          <w:rFonts w:hint="default" w:ascii="Times New Roman" w:hAnsi="Times New Roman" w:cs="Times New Roman"/>
+          <w:sz w:val="24"/>
+          <w:szCs w:val="24"/>
+          <w:u w:val="none"/>
+          <w:lang w:val="el-GR"/>
+        </w:rPr>
+        <w:t>Εισαγωγή/Εξαγωγή βάσης</w:t>
+      </w:r>
+    </w:p>
+    <w:p>
+      <w:pPr>
+        <w:numPr>
+          <w:ilvl w:val="0"/>
+          <w:numId w:val="3"/>
+        </w:numPr>
+        <w:bidi w:val="0"/>
+        <w:ind w:left="420" w:leftChars="0" w:hanging="420" w:firstLineChars="0"/>
+        <w:jc w:val="both"/>
+        <w:rPr>
+          <w:rFonts w:hint="default" w:ascii="Times New Roman" w:hAnsi="Times New Roman" w:cs="Times New Roman"/>
+          <w:sz w:val="24"/>
+          <w:szCs w:val="24"/>
+          <w:u w:val="none"/>
+          <w:lang w:val="el-GR"/>
+        </w:rPr>
+      </w:pPr>
+      <w:r>
+        <w:rPr>
+          <w:rFonts w:hint="default" w:ascii="Times New Roman" w:hAnsi="Times New Roman" w:cs="Times New Roman"/>
+          <w:sz w:val="24"/>
+          <w:szCs w:val="24"/>
+          <w:u w:val="none"/>
+          <w:lang w:val="el-GR"/>
+        </w:rPr>
+        <w:t>Αλλαγή κωδικού πρόσβασης</w:t>
+      </w:r>
+    </w:p>
+    <w:p>
+      <w:pPr>
+        <w:numPr>
+          <w:ilvl w:val="0"/>
+          <w:numId w:val="3"/>
+        </w:numPr>
+        <w:bidi w:val="0"/>
+        <w:ind w:left="420" w:leftChars="0" w:hanging="420" w:firstLineChars="0"/>
+        <w:jc w:val="both"/>
+        <w:rPr>
+          <w:rFonts w:hint="default" w:ascii="Times New Roman" w:hAnsi="Times New Roman" w:cs="Times New Roman"/>
+          <w:sz w:val="24"/>
+          <w:szCs w:val="24"/>
+          <w:u w:val="none"/>
+          <w:lang w:val="el-GR"/>
+        </w:rPr>
+      </w:pPr>
+      <w:r>
+        <w:rPr>
+          <w:rFonts w:hint="default" w:ascii="Times New Roman" w:hAnsi="Times New Roman" w:cs="Times New Roman"/>
+          <w:sz w:val="24"/>
+          <w:szCs w:val="24"/>
+          <w:u w:val="none"/>
+          <w:lang w:val="el-GR"/>
+        </w:rPr>
+        <w:t>Έξοδος χρήστη</w:t>
+      </w:r>
     </w:p>
     <w:p>
       <w:pPr>
@@ -949,7 +1415,7 @@
       <w:pPr>
         <w:numPr>
           <w:ilvl w:val="0"/>
-          <w:numId w:val="3"/>
+          <w:numId w:val="4"/>
         </w:numPr>
         <w:ind w:left="420" w:leftChars="0" w:hanging="420" w:firstLineChars="0"/>
         <w:jc w:val="both"/>
@@ -983,7 +1449,7 @@
       <w:pPr>
         <w:numPr>
           <w:ilvl w:val="0"/>
-          <w:numId w:val="3"/>
+          <w:numId w:val="4"/>
         </w:numPr>
         <w:ind w:left="420" w:leftChars="0" w:hanging="420" w:firstLineChars="0"/>
         <w:jc w:val="both"/>
@@ -1017,7 +1483,7 @@
       <w:pPr>
         <w:numPr>
           <w:ilvl w:val="0"/>
-          <w:numId w:val="3"/>
+          <w:numId w:val="4"/>
         </w:numPr>
         <w:ind w:left="420" w:leftChars="0" w:hanging="420" w:firstLineChars="0"/>
         <w:jc w:val="both"/>
@@ -1051,7 +1517,7 @@
       <w:pPr>
         <w:numPr>
           <w:ilvl w:val="0"/>
-          <w:numId w:val="3"/>
+          <w:numId w:val="4"/>
         </w:numPr>
         <w:ind w:left="420" w:leftChars="0" w:hanging="420" w:firstLineChars="0"/>
         <w:jc w:val="both"/>
@@ -1103,7 +1569,7 @@
       <w:pPr>
         <w:numPr>
           <w:ilvl w:val="0"/>
-          <w:numId w:val="3"/>
+          <w:numId w:val="4"/>
         </w:numPr>
         <w:ind w:left="420" w:leftChars="0" w:hanging="420" w:firstLineChars="0"/>
         <w:jc w:val="both"/>
@@ -1127,6 +1593,7 @@
     <w:p>
       <w:pPr>
         <w:numPr>
+          <w:ilvl w:val="0"/>
           <w:numId w:val="0"/>
         </w:numPr>
         <w:jc w:val="both"/>
@@ -1141,6 +1608,7 @@
     <w:p>
       <w:pPr>
         <w:numPr>
+          <w:ilvl w:val="0"/>
           <w:numId w:val="0"/>
         </w:numPr>
         <w:jc w:val="both"/>
@@ -1155,6 +1623,7 @@
     <w:p>
       <w:pPr>
         <w:numPr>
+          <w:ilvl w:val="0"/>
           <w:numId w:val="0"/>
         </w:numPr>
         <w:jc w:val="both"/>
@@ -1179,6 +1648,26 @@
 <file path=word/numbering.xml><?xml version="1.0" encoding="utf-8"?>
 <w:numbering xmlns:wpc="http://schemas.microsoft.com/office/word/2010/wordprocessingCanvas" xmlns:mc="http://schemas.openxmlformats.org/markup-compatibility/2006" xmlns:o="urn:schemas-microsoft-com:office:office" xmlns:r="http://schemas.openxmlformats.org/officeDocument/2006/relationships" xmlns:m="http://schemas.openxmlformats.org/officeDocument/2006/math" xmlns:v="urn:schemas-microsoft-com:vml" xmlns:wp14="http://schemas.microsoft.com/office/word/2010/wordprocessingDrawing" xmlns:wp="http://schemas.openxmlformats.org/drawingml/2006/wordprocessingDrawing" xmlns:w10="urn:schemas-microsoft-com:office:word" xmlns:w="http://schemas.openxmlformats.org/wordprocessingml/2006/main" xmlns:w14="http://schemas.microsoft.com/office/word/2010/wordml" xmlns:wpg="http://schemas.microsoft.com/office/word/2010/wordprocessingGroup" xmlns:wpi="http://schemas.microsoft.com/office/word/2010/wordprocessingInk" xmlns:wne="http://schemas.microsoft.com/office/word/2006/wordml" xmlns:wps="http://schemas.microsoft.com/office/word/2010/wordprocessingShape" xmlns:wpsCustomData="http://www.wps.cn/officeDocument/2013/wpsCustomData" mc:Ignorable="w14 wp14">
   <w:abstractNum w:abstractNumId="0">
+    <w:nsid w:val="B4F0B77D"/>
+    <w:multiLevelType w:val="singleLevel"/>
+    <w:tmpl w:val="B4F0B77D"/>
+    <w:lvl w:ilvl="0" w:tentative="0">
+      <w:start w:val="1"/>
+      <w:numFmt w:val="bullet"/>
+      <w:lvlText w:val=""/>
+      <w:lvlJc w:val="left"/>
+      <w:pPr>
+        <w:tabs>
+          <w:tab w:val="left" w:pos="420"/>
+        </w:tabs>
+        <w:ind w:left="420" w:leftChars="0" w:hanging="420" w:firstLineChars="0"/>
+      </w:pPr>
+      <w:rPr>
+        <w:rFonts w:hint="default" w:ascii="Wingdings" w:hAnsi="Wingdings"/>
+      </w:rPr>
+    </w:lvl>
+  </w:abstractNum>
+  <w:abstractNum w:abstractNumId="1">
     <w:nsid w:val="5D950FE1"/>
     <w:multiLevelType w:val="singleLevel"/>
     <w:tmpl w:val="5D950FE1"/>
@@ -1198,7 +1687,7 @@
       </w:rPr>
     </w:lvl>
   </w:abstractNum>
-  <w:abstractNum w:abstractNumId="1">
+  <w:abstractNum w:abstractNumId="2">
     <w:nsid w:val="6AABAE44"/>
     <w:multiLevelType w:val="singleLevel"/>
     <w:tmpl w:val="6AABAE44"/>
@@ -1218,7 +1707,7 @@
       </w:rPr>
     </w:lvl>
   </w:abstractNum>
-  <w:abstractNum w:abstractNumId="2">
+  <w:abstractNum w:abstractNumId="3">
     <w:nsid w:val="78E1DD06"/>
     <w:multiLevelType w:val="singleLevel"/>
     <w:tmpl w:val="78E1DD06"/>
@@ -1239,13 +1728,16 @@
     </w:lvl>
   </w:abstractNum>
   <w:num w:numId="1">
+    <w:abstractNumId w:val="2"/>
+  </w:num>
+  <w:num w:numId="2">
     <w:abstractNumId w:val="1"/>
   </w:num>
-  <w:num w:numId="2">
+  <w:num w:numId="3">
     <w:abstractNumId w:val="0"/>
   </w:num>
-  <w:num w:numId="3">
-    <w:abstractNumId w:val="2"/>
+  <w:num w:numId="4">
+    <w:abstractNumId w:val="3"/>
   </w:num>
 </w:numbering>
 </file>

</xml_diff>

<commit_message>
added next and previous hours in the displauy machinery interface added legend for colors report is slightly different updated user manual
</commit_message>
<xml_diff>
--- a/Assets/User Manual/UserManual.docx
+++ b/Assets/User Manual/UserManual.docx
@@ -5,7 +5,7 @@
     <w:p>
       <w:r>
         <w:pict>
-          <v:rect id="_x0000_s1035" o:spid="_x0000_s1035" o:spt="1" style="position:absolute;left:0pt;margin-left:4.6pt;margin-top:388.55pt;height:132pt;width:448.85pt;z-index:251660288;mso-width-relative:page;mso-height-relative:page;" stroked="f" coordsize="21600,21600">
+          <v:rect id="_x0000_s1035" o:spid="_x0000_s1035" o:spt="1" style="position:absolute;left:0pt;margin-left:4.6pt;margin-top:388.55pt;height:132pt;width:448.85pt;z-index:251661312;mso-width-relative:page;mso-height-relative:page;" stroked="f" coordsize="21600,21600">
             <v:path/>
             <v:fill focussize="0,0"/>
             <v:stroke on="f"/>
@@ -45,11 +45,11 @@
           <w:lang w:eastAsia="zh-CN"/>
         </w:rPr>
         <w:pict>
-          <v:shape id="_x0000_s1036" o:spid="_x0000_s1036" o:spt="75" type="#_x0000_t75" style="position:absolute;left:0pt;height:453.4pt;width:612.5pt;mso-position-horizontal:left;mso-position-horizontal-relative:page;mso-position-vertical:top;mso-position-vertical-relative:page;z-index:-251657216;mso-width-relative:page;mso-height-relative:page;" filled="f" o:preferrelative="t" stroked="f" coordsize="21600,21600">
+          <v:shape id="_x0000_s1036" o:spid="_x0000_s1036" o:spt="75" type="#_x0000_t75" style="position:absolute;left:0pt;height:453.4pt;width:612.5pt;mso-position-horizontal:left;mso-position-horizontal-relative:page;mso-position-vertical:top;mso-position-vertical-relative:page;z-index:-251656192;mso-width-relative:page;mso-height-relative:page;" filled="f" o:preferrelative="t" stroked="f" coordsize="21600,21600">
             <v:path/>
             <v:fill on="f" focussize="0,0"/>
             <v:stroke on="f"/>
-            <v:imagedata r:id="rId4" o:title="未标题-1"/>
+            <v:imagedata r:id="rId6" o:title="未标题-1"/>
             <o:lock v:ext="edit" grouping="f" rotation="f" text="f" aspectratio="t"/>
           </v:shape>
         </w:pict>
@@ -69,8 +69,10 @@
           <w:lang w:val="el-GR"/>
         </w:rPr>
         <w:sectPr>
+          <w:footerReference r:id="rId3" w:type="default"/>
           <w:pgSz w:w="11906" w:h="16838"/>
           <w:pgMar w:top="1440" w:right="1800" w:bottom="1440" w:left="1800" w:header="720" w:footer="720" w:gutter="0"/>
+          <w:pgNumType w:fmt="decimal" w:start="0"/>
           <w:cols w:space="720" w:num="1"/>
           <w:docGrid w:linePitch="360" w:charSpace="0"/>
         </w:sectPr>
@@ -616,8 +618,8 @@
           <w:lang w:val="el-GR"/>
         </w:rPr>
       </w:pPr>
-      <w:bookmarkStart w:id="0" w:name="_Toc31892"/>
-      <w:bookmarkStart w:id="1" w:name="_Toc7757"/>
+      <w:bookmarkStart w:id="0" w:name="_Toc7757"/>
+      <w:bookmarkStart w:id="1" w:name="_Toc31892"/>
       <w:r>
         <w:rPr>
           <w:rFonts w:hint="default" w:ascii="Times New Roman" w:hAnsi="Times New Roman" w:cs="Times New Roman"/>
@@ -658,7 +660,7 @@
                     </pic:cNvPicPr>
                   </pic:nvPicPr>
                   <pic:blipFill>
-                    <a:blip r:embed="rId5"/>
+                    <a:blip r:embed="rId7"/>
                     <a:stretch>
                       <a:fillRect/>
                     </a:stretch>
@@ -703,8 +705,8 @@
           <w:lang w:val="el-GR"/>
         </w:rPr>
       </w:pPr>
-      <w:bookmarkStart w:id="2" w:name="_Toc26338"/>
-      <w:bookmarkStart w:id="3" w:name="_Toc10476"/>
+      <w:bookmarkStart w:id="2" w:name="_Toc10476"/>
+      <w:bookmarkStart w:id="3" w:name="_Toc26338"/>
       <w:r>
         <w:rPr>
           <w:rFonts w:hint="default" w:ascii="Times New Roman" w:hAnsi="Times New Roman" w:cs="Times New Roman"/>
@@ -742,7 +744,7 @@
                     </pic:cNvPicPr>
                   </pic:nvPicPr>
                   <pic:blipFill>
-                    <a:blip r:embed="rId6"/>
+                    <a:blip r:embed="rId8"/>
                     <a:stretch>
                       <a:fillRect/>
                     </a:stretch>
@@ -860,7 +862,7 @@
                     </pic:cNvPicPr>
                   </pic:nvPicPr>
                   <pic:blipFill>
-                    <a:blip r:embed="rId7"/>
+                    <a:blip r:embed="rId9"/>
                     <a:stretch>
                       <a:fillRect/>
                     </a:stretch>
@@ -980,7 +982,7 @@
                     </pic:cNvPicPr>
                   </pic:nvPicPr>
                   <pic:blipFill>
-                    <a:blip r:embed="rId8"/>
+                    <a:blip r:embed="rId10"/>
                     <a:stretch>
                       <a:fillRect/>
                     </a:stretch>
@@ -1212,7 +1214,7 @@
                     </pic:cNvPicPr>
                   </pic:nvPicPr>
                   <pic:blipFill>
-                    <a:blip r:embed="rId9"/>
+                    <a:blip r:embed="rId11"/>
                     <a:stretch>
                       <a:fillRect/>
                     </a:stretch>
@@ -1415,7 +1417,7 @@
                     </pic:cNvPicPr>
                   </pic:nvPicPr>
                   <pic:blipFill>
-                    <a:blip r:embed="rId10"/>
+                    <a:blip r:embed="rId12"/>
                     <a:stretch>
                       <a:fillRect/>
                     </a:stretch>
@@ -1602,6 +1604,7 @@
     <w:p>
       <w:pPr>
         <w:numPr>
+          <w:ilvl w:val="0"/>
           <w:numId w:val="0"/>
         </w:numPr>
         <w:tabs>
@@ -1687,7 +1690,7 @@
                     </pic:cNvPicPr>
                   </pic:nvPicPr>
                   <pic:blipFill>
-                    <a:blip r:embed="rId11"/>
+                    <a:blip r:embed="rId13"/>
                     <a:stretch>
                       <a:fillRect/>
                     </a:stretch>
@@ -1730,8 +1733,6 @@
         </w:rPr>
         <w:t>Από αριστερά προς δεξιά:</w:t>
       </w:r>
-      <w:bookmarkStart w:id="9" w:name="_GoBack"/>
-      <w:bookmarkEnd w:id="9"/>
     </w:p>
     <w:p>
       <w:pPr>
@@ -1960,6 +1961,7 @@
     <w:p>
       <w:pPr>
         <w:numPr>
+          <w:ilvl w:val="0"/>
           <w:numId w:val="0"/>
         </w:numPr>
         <w:tabs>
@@ -1978,6 +1980,36 @@
     </w:p>
     <w:p>
       <w:pPr>
+        <w:numPr>
+          <w:ilvl w:val="0"/>
+          <w:numId w:val="0"/>
+        </w:numPr>
+        <w:tabs>
+          <w:tab w:val="left" w:pos="420"/>
+        </w:tabs>
+        <w:bidi w:val="0"/>
+        <w:jc w:val="both"/>
+        <w:rPr>
+          <w:rFonts w:hint="default" w:ascii="Times New Roman" w:hAnsi="Times New Roman" w:cs="Times New Roman"/>
+          <w:sz w:val="24"/>
+          <w:szCs w:val="24"/>
+          <w:u w:val="none"/>
+          <w:lang w:val="el-GR"/>
+        </w:rPr>
+      </w:pPr>
+      <w:r>
+        <w:rPr>
+          <w:rFonts w:hint="default" w:ascii="Times New Roman" w:hAnsi="Times New Roman" w:cs="Times New Roman"/>
+          <w:sz w:val="24"/>
+          <w:szCs w:val="24"/>
+          <w:u w:val="none"/>
+          <w:lang w:val="el-GR"/>
+        </w:rPr>
+        <w:t>Περιγραφες κουμπιων και εικονες</w:t>
+      </w:r>
+    </w:p>
+    <w:p>
+      <w:pPr>
         <w:rPr>
           <w:rFonts w:hint="default" w:ascii="Times New Roman" w:hAnsi="Times New Roman" w:cs="Times New Roman"/>
           <w:lang w:val="el-GR"/>
@@ -2002,8 +2034,8 @@
           <w:lang w:val="en-US"/>
         </w:rPr>
       </w:pPr>
-      <w:bookmarkStart w:id="6" w:name="_Toc31484"/>
-      <w:bookmarkStart w:id="7" w:name="_Toc1011"/>
+      <w:bookmarkStart w:id="6" w:name="_Toc1011"/>
+      <w:bookmarkStart w:id="7" w:name="_Toc31484"/>
       <w:r>
         <w:rPr>
           <w:rFonts w:hint="default" w:ascii="Times New Roman" w:hAnsi="Times New Roman" w:cs="Times New Roman"/>
@@ -2047,16 +2079,16 @@
           <w:szCs w:val="24"/>
           <w:lang w:val="en-US"/>
         </w:rPr>
-        <w:t xml:space="preserve">settings </w:t>
-      </w:r>
-      <w:r>
-        <w:rPr>
-          <w:rFonts w:hint="default" w:ascii="Times New Roman" w:hAnsi="Times New Roman" w:cs="Times New Roman"/>
-          <w:sz w:val="24"/>
-          <w:szCs w:val="24"/>
-          <w:lang w:val="el-GR"/>
-        </w:rPr>
-        <w:t>περιέχει μερικές ρυθμίσεις του προγράμματος:</w:t>
+        <w:t xml:space="preserve">settings.txt </w:t>
+      </w:r>
+      <w:r>
+        <w:rPr>
+          <w:rFonts w:hint="default" w:ascii="Times New Roman" w:hAnsi="Times New Roman" w:cs="Times New Roman"/>
+          <w:sz w:val="24"/>
+          <w:szCs w:val="24"/>
+          <w:lang w:val="el-GR"/>
+        </w:rPr>
+        <w:t>περιέχει τις ρυθμίσεις του προγράμματος:</w:t>
       </w:r>
     </w:p>
     <w:p>
@@ -2183,59 +2215,91 @@
           <w:szCs w:val="24"/>
           <w:lang w:val="en-US"/>
         </w:rPr>
-        <w:t xml:space="preserve">FullPath: </w:t>
-      </w:r>
-      <w:r>
-        <w:rPr>
-          <w:rFonts w:hint="default" w:ascii="Times New Roman" w:hAnsi="Times New Roman" w:cs="Times New Roman"/>
-          <w:sz w:val="24"/>
-          <w:szCs w:val="24"/>
-          <w:lang w:val="el-GR"/>
-        </w:rPr>
-        <w:t>η πλήρης τοποθεσία(διεύθυνση)</w:t>
-      </w:r>
-      <w:r>
-        <w:rPr>
-          <w:rFonts w:hint="default" w:ascii="Times New Roman" w:hAnsi="Times New Roman" w:cs="Times New Roman"/>
-          <w:sz w:val="24"/>
-          <w:szCs w:val="24"/>
-          <w:lang w:val="en-US"/>
-        </w:rPr>
-        <w:t xml:space="preserve"> </w:t>
-      </w:r>
-      <w:r>
-        <w:rPr>
-          <w:rFonts w:hint="default" w:ascii="Times New Roman" w:hAnsi="Times New Roman" w:cs="Times New Roman"/>
-          <w:sz w:val="24"/>
-          <w:szCs w:val="24"/>
-          <w:lang w:val="el-GR"/>
-        </w:rPr>
-        <w:t>όπου βρίσκεται η παραπάνω εικόνα.</w:t>
-      </w:r>
-    </w:p>
-    <w:p>
-      <w:pPr>
-        <w:numPr>
-          <w:ilvl w:val="0"/>
-          <w:numId w:val="4"/>
-        </w:numPr>
-        <w:ind w:left="420" w:leftChars="0" w:hanging="420" w:firstLineChars="0"/>
-        <w:jc w:val="both"/>
-        <w:rPr>
-          <w:rFonts w:hint="default" w:ascii="Times New Roman" w:hAnsi="Times New Roman" w:cs="Times New Roman"/>
-          <w:sz w:val="24"/>
-          <w:szCs w:val="24"/>
-          <w:lang w:val="el-GR"/>
-        </w:rPr>
-      </w:pPr>
-      <w:r>
-        <w:rPr>
-          <w:rFonts w:hint="default" w:ascii="Times New Roman" w:hAnsi="Times New Roman" w:cs="Times New Roman"/>
-          <w:sz w:val="24"/>
-          <w:szCs w:val="24"/>
-          <w:lang w:val="el-GR"/>
-        </w:rPr>
-        <w:t>.....</w:t>
+        <w:t xml:space="preserve">shipName: </w:t>
+      </w:r>
+      <w:r>
+        <w:rPr>
+          <w:rFonts w:hint="default" w:ascii="Times New Roman" w:hAnsi="Times New Roman" w:cs="Times New Roman"/>
+          <w:sz w:val="24"/>
+          <w:szCs w:val="24"/>
+          <w:lang w:val="el-GR"/>
+        </w:rPr>
+        <w:t>το όνομα του πλοίου.</w:t>
+      </w:r>
+    </w:p>
+    <w:p>
+      <w:pPr>
+        <w:numPr>
+          <w:numId w:val="0"/>
+        </w:numPr>
+        <w:ind w:leftChars="0"/>
+        <w:jc w:val="both"/>
+        <w:rPr>
+          <w:rFonts w:hint="default" w:ascii="Times New Roman" w:hAnsi="Times New Roman" w:cs="Times New Roman"/>
+          <w:sz w:val="24"/>
+          <w:szCs w:val="24"/>
+          <w:lang w:val="el-GR"/>
+        </w:rPr>
+      </w:pPr>
+    </w:p>
+    <w:p>
+      <w:pPr>
+        <w:numPr>
+          <w:numId w:val="0"/>
+        </w:numPr>
+        <w:ind w:leftChars="0"/>
+        <w:jc w:val="both"/>
+        <w:rPr>
+          <w:rFonts w:hint="default" w:ascii="Times New Roman" w:hAnsi="Times New Roman" w:cs="Times New Roman"/>
+          <w:sz w:val="24"/>
+          <w:szCs w:val="24"/>
+          <w:lang w:val="el-GR"/>
+        </w:rPr>
+      </w:pPr>
+      <w:r>
+        <w:rPr>
+          <w:rFonts w:hint="default" w:ascii="Times New Roman" w:hAnsi="Times New Roman" w:cs="Times New Roman"/>
+          <w:sz w:val="24"/>
+          <w:szCs w:val="24"/>
+          <w:lang w:val="el-GR"/>
+        </w:rPr>
+        <w:t xml:space="preserve">Ο φάκελος επίσης περιέχει δύο αρχεία εικόνων, το </w:t>
+      </w:r>
+      <w:r>
+        <w:rPr>
+          <w:rFonts w:hint="default" w:ascii="Times New Roman" w:hAnsi="Times New Roman" w:cs="Times New Roman"/>
+          <w:sz w:val="24"/>
+          <w:szCs w:val="24"/>
+          <w:lang w:val="en-US"/>
+        </w:rPr>
+        <w:t xml:space="preserve">badge.png </w:t>
+      </w:r>
+      <w:r>
+        <w:rPr>
+          <w:rFonts w:hint="default" w:ascii="Times New Roman" w:hAnsi="Times New Roman" w:cs="Times New Roman"/>
+          <w:sz w:val="24"/>
+          <w:szCs w:val="24"/>
+          <w:lang w:val="el-GR"/>
+        </w:rPr>
+        <w:t xml:space="preserve">όπως ανωτέρω και το </w:t>
+      </w:r>
+      <w:r>
+        <w:rPr>
+          <w:rFonts w:hint="default" w:ascii="Times New Roman" w:hAnsi="Times New Roman" w:cs="Times New Roman"/>
+          <w:sz w:val="24"/>
+          <w:szCs w:val="24"/>
+          <w:lang w:val="en-US"/>
+        </w:rPr>
+        <w:t>HN.png</w:t>
+      </w:r>
+      <w:r>
+        <w:rPr>
+          <w:rFonts w:hint="default" w:ascii="Times New Roman" w:hAnsi="Times New Roman" w:cs="Times New Roman"/>
+          <w:sz w:val="24"/>
+          <w:szCs w:val="24"/>
+          <w:lang w:val="el-GR"/>
+        </w:rPr>
+        <w:t>. Τα δύο αυτά αρχεία χρησιμοποιούνται για την εκτύπωση αναφοράς.</w:t>
       </w:r>
     </w:p>
     <w:p>
@@ -2279,18 +2343,295 @@
           <w:rFonts w:hint="default" w:ascii="Times New Roman" w:hAnsi="Times New Roman" w:cs="Times New Roman"/>
           <w:sz w:val="24"/>
           <w:szCs w:val="24"/>
-          <w:lang w:val="en-US"/>
-        </w:rPr>
-      </w:pPr>
+          <w:lang w:val="el-GR"/>
+        </w:rPr>
+      </w:pPr>
+      <w:r>
+        <w:rPr>
+          <w:rFonts w:hint="default" w:ascii="Times New Roman" w:hAnsi="Times New Roman" w:cs="Times New Roman"/>
+          <w:sz w:val="24"/>
+          <w:szCs w:val="24"/>
+          <w:lang w:val="el-GR"/>
+        </w:rPr>
+        <w:t xml:space="preserve">Στο τελος </w:t>
+      </w:r>
+      <w:r>
+        <w:rPr>
+          <w:rFonts w:hint="default" w:ascii="Times New Roman" w:hAnsi="Times New Roman" w:cs="Times New Roman"/>
+          <w:sz w:val="24"/>
+          <w:szCs w:val="24"/>
+          <w:lang w:val="en-US"/>
+        </w:rPr>
+        <w:t xml:space="preserve">annex </w:t>
+      </w:r>
+      <w:r>
+        <w:rPr>
+          <w:rFonts w:hint="default" w:ascii="Times New Roman" w:hAnsi="Times New Roman" w:cs="Times New Roman"/>
+          <w:sz w:val="24"/>
+          <w:szCs w:val="24"/>
+          <w:lang w:val="el-GR"/>
+        </w:rPr>
+        <w:t>που να λεει οτι το εκανα εγω</w:t>
+      </w:r>
+      <w:bookmarkStart w:id="9" w:name="_GoBack"/>
+      <w:bookmarkEnd w:id="9"/>
     </w:p>
     <w:sectPr>
+      <w:footerReference r:id="rId4" w:type="default"/>
       <w:pgSz w:w="11906" w:h="16838"/>
       <w:pgMar w:top="1440" w:right="1800" w:bottom="1440" w:left="1800" w:header="720" w:footer="720" w:gutter="0"/>
+      <w:pgNumType w:fmt="decimal" w:start="1"/>
       <w:cols w:space="720" w:num="1"/>
       <w:docGrid w:linePitch="360" w:charSpace="0"/>
     </w:sectPr>
   </w:body>
 </w:document>
+</file>
+
+<file path=word/footer1.xml><?xml version="1.0" encoding="utf-8"?>
+<w:ftr xmlns:wpc="http://schemas.microsoft.com/office/word/2010/wordprocessingCanvas" xmlns:mc="http://schemas.openxmlformats.org/markup-compatibility/2006" xmlns:o="urn:schemas-microsoft-com:office:office" xmlns:r="http://schemas.openxmlformats.org/officeDocument/2006/relationships" xmlns:m="http://schemas.openxmlformats.org/officeDocument/2006/math" xmlns:v="urn:schemas-microsoft-com:vml" xmlns:wp14="http://schemas.microsoft.com/office/word/2010/wordprocessingDrawing" xmlns:wp="http://schemas.openxmlformats.org/drawingml/2006/wordprocessingDrawing" xmlns:w10="urn:schemas-microsoft-com:office:word" xmlns:w="http://schemas.openxmlformats.org/wordprocessingml/2006/main" xmlns:w14="http://schemas.microsoft.com/office/word/2010/wordml" xmlns:w15="http://schemas.microsoft.com/office/word/2012/wordml" xmlns:wpg="http://schemas.microsoft.com/office/word/2010/wordprocessingGroup" xmlns:wpi="http://schemas.microsoft.com/office/word/2010/wordprocessingInk" xmlns:wne="http://schemas.microsoft.com/office/word/2006/wordml" xmlns:wps="http://schemas.microsoft.com/office/word/2010/wordprocessingShape" xmlns:wpsCustomData="http://www.wps.cn/officeDocument/2013/wpsCustomData" mc:Ignorable="w14 w15 wp14">
+  <w:p>
+    <w:pPr>
+      <w:pStyle w:val="7"/>
+    </w:pPr>
+    <w:r>
+      <w:rPr>
+        <w:sz w:val="18"/>
+      </w:rPr>
+      <mc:AlternateContent>
+        <mc:Choice Requires="wps">
+          <w:drawing>
+            <wp:anchor distT="0" distB="0" distL="114300" distR="114300" simplePos="0" relativeHeight="251659264" behindDoc="0" locked="0" layoutInCell="1" allowOverlap="1">
+              <wp:simplePos x="0" y="0"/>
+              <wp:positionH relativeFrom="margin">
+                <wp:align>right</wp:align>
+              </wp:positionH>
+              <wp:positionV relativeFrom="paragraph">
+                <wp:posOffset>0</wp:posOffset>
+              </wp:positionV>
+              <wp:extent cx="1828800" cy="1828800"/>
+              <wp:effectExtent l="0" t="0" r="0" b="0"/>
+              <wp:wrapNone/>
+              <wp:docPr id="3" name="Text Box 3"/>
+              <wp:cNvGraphicFramePr/>
+              <a:graphic xmlns:a="http://schemas.openxmlformats.org/drawingml/2006/main">
+                <a:graphicData uri="http://schemas.microsoft.com/office/word/2010/wordprocessingShape">
+                  <wps:wsp>
+                    <wps:cNvSpPr txBox="1"/>
+                    <wps:spPr>
+                      <a:xfrm>
+                        <a:off x="0" y="0"/>
+                        <a:ext cx="1828800" cy="1828800"/>
+                      </a:xfrm>
+                      <a:prstGeom prst="rect">
+                        <a:avLst/>
+                      </a:prstGeom>
+                      <a:noFill/>
+                      <a:ln w="6350">
+                        <a:noFill/>
+                      </a:ln>
+                      <a:extLst>
+                        <a:ext uri="{909E8E84-426E-40DD-AFC4-6F175D3DCCD1}">
+                          <a14:hiddenFill xmlns:a14="http://schemas.microsoft.com/office/drawing/2010/main">
+                            <a:solidFill>
+                              <a:schemeClr val="lt1"/>
+                            </a:solidFill>
+                          </a14:hiddenFill>
+                        </a:ext>
+                        <a:ext uri="{91240B29-F687-4F45-9708-019B960494DF}">
+                          <a14:hiddenLine xmlns:a14="http://schemas.microsoft.com/office/drawing/2010/main" w="6350">
+                            <a:solidFill>
+                              <a:prstClr val="black"/>
+                            </a:solidFill>
+                          </a14:hiddenLine>
+                        </a:ext>
+                      </a:extLst>
+                    </wps:spPr>
+                    <wps:style>
+                      <a:lnRef idx="0">
+                        <a:schemeClr val="accent1"/>
+                      </a:lnRef>
+                      <a:fillRef idx="0">
+                        <a:schemeClr val="accent1"/>
+                      </a:fillRef>
+                      <a:effectRef idx="0">
+                        <a:schemeClr val="accent1"/>
+                      </a:effectRef>
+                      <a:fontRef idx="minor">
+                        <a:schemeClr val="dk1"/>
+                      </a:fontRef>
+                    </wps:style>
+                    <wps:txbx>
+                      <w:txbxContent>
+                        <w:p>
+                          <w:pPr>
+                            <w:pStyle w:val="7"/>
+                          </w:pPr>
+                        </w:p>
+                      </w:txbxContent>
+                    </wps:txbx>
+                    <wps:bodyPr rot="0" spcFirstLastPara="0" vertOverflow="overflow" horzOverflow="overflow" vert="horz" wrap="none" lIns="0" tIns="0" rIns="0" bIns="0" numCol="1" spcCol="0" rtlCol="0" fromWordArt="0" anchor="t" anchorCtr="0" forceAA="0" upright="0" compatLnSpc="1">
+                      <a:spAutoFit/>
+                    </wps:bodyPr>
+                  </wps:wsp>
+                </a:graphicData>
+              </a:graphic>
+            </wp:anchor>
+          </w:drawing>
+        </mc:Choice>
+        <mc:Fallback>
+          <w:pict>
+            <v:shape id="_x0000_s1026" o:spid="_x0000_s1026" o:spt="202" type="#_x0000_t202" style="position:absolute;left:0pt;margin-top:0pt;height:144pt;width:144pt;mso-position-horizontal:right;mso-position-horizontal-relative:margin;mso-wrap-style:none;z-index:251659264;mso-width-relative:page;mso-height-relative:page;" filled="f" stroked="f" coordsize="21600,21600" o:gfxdata="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">
+              <v:fill on="f" focussize="0,0"/>
+              <v:stroke on="f" weight="0.5pt"/>
+              <v:imagedata o:title=""/>
+              <o:lock v:ext="edit" aspectratio="f"/>
+              <v:textbox inset="0mm,0mm,0mm,0mm" style="mso-fit-shape-to-text:t;">
+                <w:txbxContent>
+                  <w:p>
+                    <w:pPr>
+                      <w:pStyle w:val="7"/>
+                    </w:pPr>
+                  </w:p>
+                </w:txbxContent>
+              </v:textbox>
+            </v:shape>
+          </w:pict>
+        </mc:Fallback>
+      </mc:AlternateContent>
+    </w:r>
+  </w:p>
+</w:ftr>
+</file>
+
+<file path=word/footer2.xml><?xml version="1.0" encoding="utf-8"?>
+<w:ftr xmlns:wpc="http://schemas.microsoft.com/office/word/2010/wordprocessingCanvas" xmlns:mc="http://schemas.openxmlformats.org/markup-compatibility/2006" xmlns:o="urn:schemas-microsoft-com:office:office" xmlns:r="http://schemas.openxmlformats.org/officeDocument/2006/relationships" xmlns:m="http://schemas.openxmlformats.org/officeDocument/2006/math" xmlns:v="urn:schemas-microsoft-com:vml" xmlns:wp14="http://schemas.microsoft.com/office/word/2010/wordprocessingDrawing" xmlns:wp="http://schemas.openxmlformats.org/drawingml/2006/wordprocessingDrawing" xmlns:w10="urn:schemas-microsoft-com:office:word" xmlns:w="http://schemas.openxmlformats.org/wordprocessingml/2006/main" xmlns:w14="http://schemas.microsoft.com/office/word/2010/wordml" xmlns:w15="http://schemas.microsoft.com/office/word/2012/wordml" xmlns:wpg="http://schemas.microsoft.com/office/word/2010/wordprocessingGroup" xmlns:wpi="http://schemas.microsoft.com/office/word/2010/wordprocessingInk" xmlns:wne="http://schemas.microsoft.com/office/word/2006/wordml" xmlns:wps="http://schemas.microsoft.com/office/word/2010/wordprocessingShape" xmlns:wpsCustomData="http://www.wps.cn/officeDocument/2013/wpsCustomData" mc:Ignorable="w14 w15 wp14">
+  <w:p>
+    <w:pPr>
+      <w:pStyle w:val="7"/>
+    </w:pPr>
+    <w:r>
+      <w:rPr>
+        <w:sz w:val="18"/>
+      </w:rPr>
+      <mc:AlternateContent>
+        <mc:Choice Requires="wps">
+          <w:drawing>
+            <wp:anchor distT="0" distB="0" distL="114300" distR="114300" simplePos="0" relativeHeight="251662336" behindDoc="0" locked="0" layoutInCell="1" allowOverlap="1">
+              <wp:simplePos x="0" y="0"/>
+              <wp:positionH relativeFrom="margin">
+                <wp:align>right</wp:align>
+              </wp:positionH>
+              <wp:positionV relativeFrom="paragraph">
+                <wp:posOffset>0</wp:posOffset>
+              </wp:positionV>
+              <wp:extent cx="1828800" cy="1828800"/>
+              <wp:effectExtent l="0" t="0" r="0" b="0"/>
+              <wp:wrapNone/>
+              <wp:docPr id="4" name="Text Box 4"/>
+              <wp:cNvGraphicFramePr/>
+              <a:graphic xmlns:a="http://schemas.openxmlformats.org/drawingml/2006/main">
+                <a:graphicData uri="http://schemas.microsoft.com/office/word/2010/wordprocessingShape">
+                  <wps:wsp>
+                    <wps:cNvSpPr txBox="1"/>
+                    <wps:spPr>
+                      <a:xfrm>
+                        <a:off x="0" y="0"/>
+                        <a:ext cx="1828800" cy="1828800"/>
+                      </a:xfrm>
+                      <a:prstGeom prst="rect">
+                        <a:avLst/>
+                      </a:prstGeom>
+                      <a:noFill/>
+                      <a:ln w="6350">
+                        <a:noFill/>
+                      </a:ln>
+                    </wps:spPr>
+                    <wps:style>
+                      <a:lnRef idx="0">
+                        <a:schemeClr val="accent1"/>
+                      </a:lnRef>
+                      <a:fillRef idx="0">
+                        <a:schemeClr val="accent1"/>
+                      </a:fillRef>
+                      <a:effectRef idx="0">
+                        <a:schemeClr val="accent1"/>
+                      </a:effectRef>
+                      <a:fontRef idx="minor">
+                        <a:schemeClr val="dk1"/>
+                      </a:fontRef>
+                    </wps:style>
+                    <wps:txbx>
+                      <w:txbxContent>
+                        <w:p>
+                          <w:pPr>
+                            <w:pStyle w:val="7"/>
+                          </w:pPr>
+                          <w:r>
+                            <w:fldChar w:fldCharType="begin"/>
+                          </w:r>
+                          <w:r>
+                            <w:instrText xml:space="preserve"> PAGE  \* MERGEFORMAT </w:instrText>
+                          </w:r>
+                          <w:r>
+                            <w:fldChar w:fldCharType="separate"/>
+                          </w:r>
+                          <w:r>
+                            <w:t>1</w:t>
+                          </w:r>
+                          <w:r>
+                            <w:fldChar w:fldCharType="end"/>
+                          </w:r>
+                        </w:p>
+                      </w:txbxContent>
+                    </wps:txbx>
+                    <wps:bodyPr rot="0" spcFirstLastPara="0" vertOverflow="overflow" horzOverflow="overflow" vert="horz" wrap="none" lIns="0" tIns="0" rIns="0" bIns="0" numCol="1" spcCol="0" rtlCol="0" fromWordArt="0" anchor="t" anchorCtr="0" forceAA="0" upright="0" compatLnSpc="1">
+                      <a:spAutoFit/>
+                    </wps:bodyPr>
+                  </wps:wsp>
+                </a:graphicData>
+              </a:graphic>
+            </wp:anchor>
+          </w:drawing>
+        </mc:Choice>
+        <mc:Fallback>
+          <w:pict>
+            <v:shape id="_x0000_s1026" o:spid="_x0000_s1026" o:spt="202" type="#_x0000_t202" style="position:absolute;left:0pt;margin-top:0pt;height:144pt;width:144pt;mso-position-horizontal:right;mso-position-horizontal-relative:margin;mso-wrap-style:none;z-index:251662336;mso-width-relative:page;mso-height-relative:page;" filled="f" stroked="f" coordsize="21600,21600" o:gfxdata="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">
+              <v:fill on="f" focussize="0,0"/>
+              <v:stroke on="f" weight="0.5pt"/>
+              <v:imagedata o:title=""/>
+              <o:lock v:ext="edit" aspectratio="f"/>
+              <v:textbox inset="0mm,0mm,0mm,0mm" style="mso-fit-shape-to-text:t;">
+                <w:txbxContent>
+                  <w:p>
+                    <w:pPr>
+                      <w:pStyle w:val="7"/>
+                    </w:pPr>
+                    <w:r>
+                      <w:fldChar w:fldCharType="begin"/>
+                    </w:r>
+                    <w:r>
+                      <w:instrText xml:space="preserve"> PAGE  \* MERGEFORMAT </w:instrText>
+                    </w:r>
+                    <w:r>
+                      <w:fldChar w:fldCharType="separate"/>
+                    </w:r>
+                    <w:r>
+                      <w:t>1</w:t>
+                    </w:r>
+                    <w:r>
+                      <w:fldChar w:fldCharType="end"/>
+                    </w:r>
+                  </w:p>
+                </w:txbxContent>
+              </v:textbox>
+            </v:shape>
+          </w:pict>
+        </mc:Fallback>
+      </mc:AlternateContent>
+    </w:r>
+  </w:p>
+</w:ftr>
 </file>
 
 <file path=word/numbering.xml><?xml version="1.0" encoding="utf-8"?>
@@ -2422,7 +2763,7 @@
     <w:lsdException w:unhideWhenUsed="0" w:uiPriority="0" w:semiHidden="0" w:name="index 9"/>
     <w:lsdException w:unhideWhenUsed="0" w:uiPriority="0" w:semiHidden="0" w:name="toc 1"/>
     <w:lsdException w:unhideWhenUsed="0" w:uiPriority="0" w:semiHidden="0" w:name="toc 2"/>
-    <w:lsdException w:unhideWhenUsed="0" w:uiPriority="0" w:semiHidden="0" w:name="toc 3"/>
+    <w:lsdException w:qFormat="1" w:unhideWhenUsed="0" w:uiPriority="0" w:semiHidden="0" w:name="toc 3"/>
     <w:lsdException w:unhideWhenUsed="0" w:uiPriority="0" w:semiHidden="0" w:name="toc 4"/>
     <w:lsdException w:unhideWhenUsed="0" w:uiPriority="0" w:semiHidden="0" w:name="toc 5"/>
     <w:lsdException w:unhideWhenUsed="0" w:uiPriority="0" w:semiHidden="0" w:name="toc 6"/>
@@ -2432,8 +2773,8 @@
     <w:lsdException w:unhideWhenUsed="0" w:uiPriority="0" w:semiHidden="0" w:name="Normal Indent"/>
     <w:lsdException w:unhideWhenUsed="0" w:uiPriority="0" w:semiHidden="0" w:name="footnote text"/>
     <w:lsdException w:unhideWhenUsed="0" w:uiPriority="0" w:semiHidden="0" w:name="annotation text"/>
-    <w:lsdException w:unhideWhenUsed="0" w:uiPriority="0" w:semiHidden="0" w:name="header"/>
-    <w:lsdException w:unhideWhenUsed="0" w:uiPriority="0" w:semiHidden="0" w:name="footer"/>
+    <w:lsdException w:qFormat="1" w:unhideWhenUsed="0" w:uiPriority="0" w:semiHidden="0" w:name="header"/>
+    <w:lsdException w:qFormat="1" w:unhideWhenUsed="0" w:uiPriority="0" w:semiHidden="0" w:name="footer"/>
     <w:lsdException w:unhideWhenUsed="0" w:uiPriority="0" w:semiHidden="0" w:name="index heading"/>
     <w:lsdException w:qFormat="1" w:uiPriority="0" w:name="caption"/>
     <w:lsdException w:unhideWhenUsed="0" w:uiPriority="0" w:semiHidden="0" w:name="table of figures"/>
@@ -2466,7 +2807,7 @@
     <w:lsdException w:qFormat="1" w:unhideWhenUsed="0" w:uiPriority="0" w:semiHidden="0" w:name="Title"/>
     <w:lsdException w:unhideWhenUsed="0" w:uiPriority="0" w:semiHidden="0" w:name="Closing"/>
     <w:lsdException w:unhideWhenUsed="0" w:uiPriority="0" w:semiHidden="0" w:name="Signature"/>
-    <w:lsdException w:unhideWhenUsed="0" w:uiPriority="0" w:name="Default Paragraph Font"/>
+    <w:lsdException w:qFormat="1" w:unhideWhenUsed="0" w:uiPriority="0" w:name="Default Paragraph Font"/>
     <w:lsdException w:unhideWhenUsed="0" w:uiPriority="0" w:semiHidden="0" w:name="Body Text"/>
     <w:lsdException w:unhideWhenUsed="0" w:uiPriority="0" w:semiHidden="0" w:name="Body Text Indent"/>
     <w:lsdException w:unhideWhenUsed="0" w:uiPriority="0" w:semiHidden="0" w:name="List Continue"/>
@@ -2722,6 +3063,7 @@
   <w:style w:type="character" w:default="1" w:styleId="5">
     <w:name w:val="Default Paragraph Font"/>
     <w:semiHidden/>
+    <w:qFormat/>
     <w:uiPriority w:val="0"/>
   </w:style>
   <w:style w:type="table" w:default="1" w:styleId="6">
@@ -2740,6 +3082,7 @@
   <w:style w:type="paragraph" w:styleId="7">
     <w:name w:val="footer"/>
     <w:basedOn w:val="1"/>
+    <w:qFormat/>
     <w:uiPriority w:val="0"/>
     <w:pPr>
       <w:widowControl w:val="0"/>
@@ -2754,12 +3097,12 @@
       <w:rFonts w:ascii="Times New Roman" w:hAnsi="Times New Roman" w:eastAsia="SimSun" w:cstheme="minorBidi"/>
       <w:kern w:val="2"/>
       <w:sz w:val="18"/>
-      <w:lang/>
     </w:rPr>
   </w:style>
   <w:style w:type="paragraph" w:styleId="8">
     <w:name w:val="header"/>
     <w:basedOn w:val="1"/>
+    <w:qFormat/>
     <w:uiPriority w:val="0"/>
     <w:pPr>
       <w:widowControl w:val="0"/>
@@ -2782,7 +3125,6 @@
       <w:rFonts w:ascii="Times New Roman" w:hAnsi="Times New Roman" w:eastAsia="SimSun" w:cstheme="minorBidi"/>
       <w:kern w:val="2"/>
       <w:sz w:val="18"/>
-      <w:lang/>
     </w:rPr>
   </w:style>
   <w:style w:type="paragraph" w:styleId="9">
@@ -2798,6 +3140,7 @@
     <w:name w:val="toc 3"/>
     <w:basedOn w:val="1"/>
     <w:next w:val="1"/>
+    <w:qFormat/>
     <w:uiPriority w:val="0"/>
     <w:pPr>
       <w:ind w:left="840" w:leftChars="400"/>
@@ -2818,7 +3161,7 @@
     <w:link w:val="11"/>
     <w:uiPriority w:val="0"/>
     <w:rPr>
-      <w:rFonts w:hint="default" w:ascii="Times New Roman" w:hAnsi="Times New Roman" w:eastAsia="SimSun"/>
+      <w:rFonts w:hint="default" w:ascii="Times New Roman" w:hAnsi="Times New Roman" w:eastAsia="SimSun" w:cstheme="minorBidi"/>
       <w:sz w:val="22"/>
     </w:rPr>
   </w:style>
@@ -3090,6 +3433,7 @@
     <customSectPr/>
   </customSectProps>
   <customShpExts>
+    <customShpInfo spid="_x0000_s1026" textRotate="1"/>
     <customShpInfo spid="_x0000_s1035"/>
     <customShpInfo spid="_x0000_s1036"/>
   </customShpExts>

</xml_diff>

<commit_message>
minor bugfix when searching for timed services
</commit_message>
<xml_diff>
--- a/Assets/User Manual/UserManual.docx
+++ b/Assets/User Manual/UserManual.docx
@@ -22,7 +22,7 @@
                       <w:szCs w:val="60"/>
                     </w:rPr>
                   </w:pPr>
-                  <w:bookmarkStart w:id="8" w:name="_Title#3910760528"/>
+                  <w:bookmarkStart w:id="9" w:name="_Title#3910760528"/>
                   <w:r>
                     <w:rPr>
                       <w:rFonts w:hint="default"/>
@@ -32,7 +32,7 @@
                     </w:rPr>
                     <w:t>Οδηγός χρήσης προγράμματος ΣΠΣ</w:t>
                   </w:r>
-                  <w:bookmarkEnd w:id="8"/>
+                  <w:bookmarkEnd w:id="9"/>
                 </w:p>
               </w:txbxContent>
             </v:textbox>
@@ -109,12 +109,16 @@
         <w:tabs>
           <w:tab w:val="right" w:leader="dot" w:pos="8306"/>
         </w:tabs>
+      </w:pPr>
+      <w:r>
         <w:rPr>
           <w:rFonts w:hint="default" w:ascii="Times New Roman" w:hAnsi="Times New Roman" w:cs="Times New Roman"/>
           <w:sz w:val="26"/>
           <w:szCs w:val="26"/>
-        </w:rPr>
-      </w:pPr>
+          <w:lang w:val="en-US"/>
+        </w:rPr>
+        <w:fldChar w:fldCharType="begin"/>
+      </w:r>
       <w:r>
         <w:rPr>
           <w:rFonts w:hint="default" w:ascii="Times New Roman" w:hAnsi="Times New Roman" w:cs="Times New Roman"/>
@@ -122,7 +126,7 @@
           <w:szCs w:val="26"/>
           <w:lang w:val="en-US"/>
         </w:rPr>
-        <w:fldChar w:fldCharType="begin"/>
+        <w:instrText xml:space="preserve">TOC \o "1-3" \h \u </w:instrText>
       </w:r>
       <w:r>
         <w:rPr>
@@ -131,39 +135,92 @@
           <w:szCs w:val="26"/>
           <w:lang w:val="en-US"/>
         </w:rPr>
-        <w:instrText xml:space="preserve">TOC \o "1-3" \h \u </w:instrText>
-      </w:r>
-      <w:r>
-        <w:rPr>
-          <w:rFonts w:hint="default" w:ascii="Times New Roman" w:hAnsi="Times New Roman" w:cs="Times New Roman"/>
-          <w:sz w:val="26"/>
+        <w:fldChar w:fldCharType="separate"/>
+      </w:r>
+      <w:r>
+        <w:rPr>
+          <w:rFonts w:hint="default" w:ascii="Times New Roman" w:hAnsi="Times New Roman" w:cs="Times New Roman"/>
           <w:szCs w:val="26"/>
           <w:lang w:val="en-US"/>
         </w:rPr>
+        <w:fldChar w:fldCharType="begin"/>
+      </w:r>
+      <w:r>
+        <w:rPr>
+          <w:rFonts w:hint="default" w:ascii="Times New Roman" w:hAnsi="Times New Roman" w:cs="Times New Roman"/>
+          <w:szCs w:val="26"/>
+          <w:lang w:val="en-US"/>
+        </w:rPr>
+        <w:instrText xml:space="preserve"> HYPERLINK \l _Toc20739 </w:instrText>
+      </w:r>
+      <w:r>
+        <w:rPr>
+          <w:rFonts w:hint="default" w:ascii="Times New Roman" w:hAnsi="Times New Roman" w:cs="Times New Roman"/>
+          <w:szCs w:val="26"/>
+          <w:lang w:val="en-US"/>
+        </w:rPr>
         <w:fldChar w:fldCharType="separate"/>
       </w:r>
       <w:r>
         <w:rPr>
           <w:rFonts w:hint="default" w:ascii="Times New Roman" w:hAnsi="Times New Roman" w:cs="Times New Roman"/>
-          <w:sz w:val="26"/>
+          <w:lang w:val="el-GR"/>
+        </w:rPr>
+        <w:t>Πρώτη χρήση</w:t>
+      </w:r>
+      <w:r>
+        <w:tab/>
+      </w:r>
+      <w:r>
+        <w:fldChar w:fldCharType="begin"/>
+      </w:r>
+      <w:r>
+        <w:instrText xml:space="preserve"> PAGEREF _Toc20739 \h </w:instrText>
+      </w:r>
+      <w:r>
+        <w:fldChar w:fldCharType="separate"/>
+      </w:r>
+      <w:r>
+        <w:t>2</w:t>
+      </w:r>
+      <w:r>
+        <w:fldChar w:fldCharType="end"/>
+      </w:r>
+      <w:r>
+        <w:rPr>
+          <w:rFonts w:hint="default" w:ascii="Times New Roman" w:hAnsi="Times New Roman" w:cs="Times New Roman"/>
           <w:szCs w:val="26"/>
           <w:lang w:val="en-US"/>
         </w:rPr>
+        <w:fldChar w:fldCharType="end"/>
+      </w:r>
+    </w:p>
+    <w:p>
+      <w:pPr>
+        <w:pStyle w:val="9"/>
+        <w:tabs>
+          <w:tab w:val="right" w:leader="dot" w:pos="8306"/>
+        </w:tabs>
+      </w:pPr>
+      <w:r>
+        <w:rPr>
+          <w:rFonts w:hint="default" w:ascii="Times New Roman" w:hAnsi="Times New Roman" w:cs="Times New Roman"/>
+          <w:szCs w:val="26"/>
+          <w:lang w:val="en-US"/>
+        </w:rPr>
         <w:fldChar w:fldCharType="begin"/>
       </w:r>
       <w:r>
         <w:rPr>
           <w:rFonts w:hint="default" w:ascii="Times New Roman" w:hAnsi="Times New Roman" w:cs="Times New Roman"/>
-          <w:sz w:val="26"/>
           <w:szCs w:val="26"/>
           <w:lang w:val="en-US"/>
         </w:rPr>
-        <w:instrText xml:space="preserve"> HYPERLINK \l _Toc7757 </w:instrText>
-      </w:r>
-      <w:r>
-        <w:rPr>
-          <w:rFonts w:hint="default" w:ascii="Times New Roman" w:hAnsi="Times New Roman" w:cs="Times New Roman"/>
-          <w:sz w:val="26"/>
+        <w:instrText xml:space="preserve"> HYPERLINK \l _Toc7275 </w:instrText>
+      </w:r>
+      <w:r>
+        <w:rPr>
+          <w:rFonts w:hint="default" w:ascii="Times New Roman" w:hAnsi="Times New Roman" w:cs="Times New Roman"/>
           <w:szCs w:val="26"/>
           <w:lang w:val="en-US"/>
         </w:rPr>
@@ -172,64 +229,103 @@
       <w:r>
         <w:rPr>
           <w:rFonts w:hint="default" w:ascii="Times New Roman" w:hAnsi="Times New Roman" w:cs="Times New Roman"/>
-          <w:sz w:val="26"/>
+          <w:lang w:val="el-GR"/>
+        </w:rPr>
+        <w:t>Είσοδος στο πρόγραμμα</w:t>
+      </w:r>
+      <w:r>
+        <w:tab/>
+      </w:r>
+      <w:r>
+        <w:fldChar w:fldCharType="begin"/>
+      </w:r>
+      <w:r>
+        <w:instrText xml:space="preserve"> PAGEREF _Toc7275 \h </w:instrText>
+      </w:r>
+      <w:r>
+        <w:fldChar w:fldCharType="separate"/>
+      </w:r>
+      <w:r>
+        <w:t>3</w:t>
+      </w:r>
+      <w:r>
+        <w:fldChar w:fldCharType="end"/>
+      </w:r>
+      <w:r>
+        <w:rPr>
+          <w:rFonts w:hint="default" w:ascii="Times New Roman" w:hAnsi="Times New Roman" w:cs="Times New Roman"/>
           <w:szCs w:val="26"/>
-          <w:lang w:val="el-GR"/>
-        </w:rPr>
-        <w:t>Είσοδος στο πρόγραμμα</w:t>
-      </w:r>
-      <w:r>
-        <w:rPr>
-          <w:rFonts w:hint="default" w:ascii="Times New Roman" w:hAnsi="Times New Roman" w:cs="Times New Roman"/>
-          <w:sz w:val="26"/>
+          <w:lang w:val="en-US"/>
+        </w:rPr>
+        <w:fldChar w:fldCharType="end"/>
+      </w:r>
+    </w:p>
+    <w:p>
+      <w:pPr>
+        <w:pStyle w:val="9"/>
+        <w:tabs>
+          <w:tab w:val="right" w:leader="dot" w:pos="8306"/>
+        </w:tabs>
+      </w:pPr>
+      <w:r>
+        <w:rPr>
+          <w:rFonts w:hint="default" w:ascii="Times New Roman" w:hAnsi="Times New Roman" w:cs="Times New Roman"/>
           <w:szCs w:val="26"/>
-        </w:rPr>
+          <w:lang w:val="en-US"/>
+        </w:rPr>
+        <w:fldChar w:fldCharType="begin"/>
+      </w:r>
+      <w:r>
+        <w:rPr>
+          <w:rFonts w:hint="default" w:ascii="Times New Roman" w:hAnsi="Times New Roman" w:cs="Times New Roman"/>
+          <w:szCs w:val="26"/>
+          <w:lang w:val="en-US"/>
+        </w:rPr>
+        <w:instrText xml:space="preserve"> HYPERLINK \l _Toc30074 </w:instrText>
+      </w:r>
+      <w:r>
+        <w:rPr>
+          <w:rFonts w:hint="default" w:ascii="Times New Roman" w:hAnsi="Times New Roman" w:cs="Times New Roman"/>
+          <w:szCs w:val="26"/>
+          <w:lang w:val="en-US"/>
+        </w:rPr>
+        <w:fldChar w:fldCharType="separate"/>
+      </w:r>
+      <w:r>
+        <w:rPr>
+          <w:rFonts w:hint="default" w:ascii="Times New Roman" w:hAnsi="Times New Roman" w:cs="Times New Roman"/>
+          <w:lang w:val="el-GR"/>
+        </w:rPr>
+        <w:t xml:space="preserve">Περιγραφή του </w:t>
+      </w:r>
+      <w:r>
+        <w:rPr>
+          <w:rFonts w:hint="default" w:ascii="Times New Roman" w:hAnsi="Times New Roman" w:cs="Times New Roman"/>
+          <w:lang w:val="en-US"/>
+        </w:rPr>
+        <w:t>Interface</w:t>
+      </w:r>
+      <w:r>
         <w:tab/>
       </w:r>
       <w:r>
-        <w:rPr>
-          <w:rFonts w:hint="default" w:ascii="Times New Roman" w:hAnsi="Times New Roman" w:cs="Times New Roman"/>
-          <w:sz w:val="26"/>
-          <w:szCs w:val="26"/>
-        </w:rPr>
         <w:fldChar w:fldCharType="begin"/>
       </w:r>
       <w:r>
-        <w:rPr>
-          <w:rFonts w:hint="default" w:ascii="Times New Roman" w:hAnsi="Times New Roman" w:cs="Times New Roman"/>
-          <w:sz w:val="26"/>
-          <w:szCs w:val="26"/>
-        </w:rPr>
-        <w:instrText xml:space="preserve"> PAGEREF _Toc7757 \h </w:instrText>
-      </w:r>
-      <w:r>
-        <w:rPr>
-          <w:rFonts w:hint="default" w:ascii="Times New Roman" w:hAnsi="Times New Roman" w:cs="Times New Roman"/>
-          <w:sz w:val="26"/>
-          <w:szCs w:val="26"/>
-        </w:rPr>
+        <w:instrText xml:space="preserve"> PAGEREF _Toc30074 \h </w:instrText>
+      </w:r>
+      <w:r>
         <w:fldChar w:fldCharType="separate"/>
       </w:r>
       <w:r>
-        <w:rPr>
-          <w:rFonts w:hint="default" w:ascii="Times New Roman" w:hAnsi="Times New Roman" w:cs="Times New Roman"/>
-          <w:sz w:val="26"/>
-          <w:szCs w:val="26"/>
-        </w:rPr>
-        <w:t>2</w:t>
-      </w:r>
-      <w:r>
-        <w:rPr>
-          <w:rFonts w:hint="default" w:ascii="Times New Roman" w:hAnsi="Times New Roman" w:cs="Times New Roman"/>
-          <w:sz w:val="26"/>
-          <w:szCs w:val="26"/>
-        </w:rPr>
+        <w:t>3</w:t>
+      </w:r>
+      <w:r>
         <w:fldChar w:fldCharType="end"/>
       </w:r>
       <w:r>
         <w:rPr>
           <w:rFonts w:hint="default" w:ascii="Times New Roman" w:hAnsi="Times New Roman" w:cs="Times New Roman"/>
-          <w:sz w:val="26"/>
           <w:szCs w:val="26"/>
           <w:lang w:val="en-US"/>
         </w:rPr>
@@ -242,100 +338,124 @@
         <w:tabs>
           <w:tab w:val="right" w:leader="dot" w:pos="8306"/>
         </w:tabs>
-        <w:rPr>
-          <w:rFonts w:hint="default" w:ascii="Times New Roman" w:hAnsi="Times New Roman" w:cs="Times New Roman"/>
-          <w:sz w:val="26"/>
+      </w:pPr>
+      <w:r>
+        <w:rPr>
+          <w:rFonts w:hint="default" w:ascii="Times New Roman" w:hAnsi="Times New Roman" w:cs="Times New Roman"/>
           <w:szCs w:val="26"/>
-        </w:rPr>
-      </w:pPr>
-      <w:r>
-        <w:rPr>
-          <w:rFonts w:hint="default" w:ascii="Times New Roman" w:hAnsi="Times New Roman" w:cs="Times New Roman"/>
-          <w:sz w:val="26"/>
+          <w:lang w:val="en-US"/>
+        </w:rPr>
+        <w:fldChar w:fldCharType="begin"/>
+      </w:r>
+      <w:r>
+        <w:rPr>
+          <w:rFonts w:hint="default" w:ascii="Times New Roman" w:hAnsi="Times New Roman" w:cs="Times New Roman"/>
           <w:szCs w:val="26"/>
           <w:lang w:val="en-US"/>
         </w:rPr>
+        <w:instrText xml:space="preserve"> HYPERLINK \l _Toc31335 </w:instrText>
+      </w:r>
+      <w:r>
+        <w:rPr>
+          <w:rFonts w:hint="default" w:ascii="Times New Roman" w:hAnsi="Times New Roman" w:cs="Times New Roman"/>
+          <w:szCs w:val="26"/>
+          <w:lang w:val="en-US"/>
+        </w:rPr>
+        <w:fldChar w:fldCharType="separate"/>
+      </w:r>
+      <w:r>
+        <w:rPr>
+          <w:rFonts w:hint="default"/>
+          <w:lang w:val="en-US"/>
+        </w:rPr>
+        <w:t>User</w:t>
+      </w:r>
+      <w:r>
+        <w:tab/>
+      </w:r>
+      <w:r>
         <w:fldChar w:fldCharType="begin"/>
       </w:r>
       <w:r>
-        <w:rPr>
-          <w:rFonts w:hint="default" w:ascii="Times New Roman" w:hAnsi="Times New Roman" w:cs="Times New Roman"/>
-          <w:sz w:val="26"/>
+        <w:instrText xml:space="preserve"> PAGEREF _Toc31335 \h </w:instrText>
+      </w:r>
+      <w:r>
+        <w:fldChar w:fldCharType="separate"/>
+      </w:r>
+      <w:r>
+        <w:t>4</w:t>
+      </w:r>
+      <w:r>
+        <w:fldChar w:fldCharType="end"/>
+      </w:r>
+      <w:r>
+        <w:rPr>
+          <w:rFonts w:hint="default" w:ascii="Times New Roman" w:hAnsi="Times New Roman" w:cs="Times New Roman"/>
           <w:szCs w:val="26"/>
           <w:lang w:val="en-US"/>
         </w:rPr>
-        <w:instrText xml:space="preserve"> HYPERLINK \l _Toc10476 </w:instrText>
-      </w:r>
-      <w:r>
-        <w:rPr>
-          <w:rFonts w:hint="default" w:ascii="Times New Roman" w:hAnsi="Times New Roman" w:cs="Times New Roman"/>
-          <w:sz w:val="26"/>
+        <w:fldChar w:fldCharType="end"/>
+      </w:r>
+    </w:p>
+    <w:p>
+      <w:pPr>
+        <w:pStyle w:val="10"/>
+        <w:tabs>
+          <w:tab w:val="right" w:leader="dot" w:pos="8306"/>
+        </w:tabs>
+      </w:pPr>
+      <w:r>
+        <w:rPr>
+          <w:rFonts w:hint="default" w:ascii="Times New Roman" w:hAnsi="Times New Roman" w:cs="Times New Roman"/>
           <w:szCs w:val="26"/>
           <w:lang w:val="en-US"/>
         </w:rPr>
+        <w:fldChar w:fldCharType="begin"/>
+      </w:r>
+      <w:r>
+        <w:rPr>
+          <w:rFonts w:hint="default" w:ascii="Times New Roman" w:hAnsi="Times New Roman" w:cs="Times New Roman"/>
+          <w:szCs w:val="26"/>
+          <w:lang w:val="en-US"/>
+        </w:rPr>
+        <w:instrText xml:space="preserve"> HYPERLINK \l _Toc13702 </w:instrText>
+      </w:r>
+      <w:r>
+        <w:rPr>
+          <w:rFonts w:hint="default" w:ascii="Times New Roman" w:hAnsi="Times New Roman" w:cs="Times New Roman"/>
+          <w:szCs w:val="26"/>
+          <w:lang w:val="en-US"/>
+        </w:rPr>
         <w:fldChar w:fldCharType="separate"/>
       </w:r>
       <w:r>
         <w:rPr>
-          <w:rFonts w:hint="default" w:ascii="Times New Roman" w:hAnsi="Times New Roman" w:cs="Times New Roman"/>
-          <w:sz w:val="26"/>
-          <w:szCs w:val="26"/>
-          <w:lang w:val="el-GR"/>
-        </w:rPr>
-        <w:t>Πρώτη χρήση</w:t>
-      </w:r>
-      <w:r>
-        <w:rPr>
-          <w:rFonts w:hint="default" w:ascii="Times New Roman" w:hAnsi="Times New Roman" w:cs="Times New Roman"/>
-          <w:sz w:val="26"/>
-          <w:szCs w:val="26"/>
-        </w:rPr>
+          <w:rFonts w:hint="default"/>
+          <w:lang w:val="en-US"/>
+        </w:rPr>
+        <w:t>Admin</w:t>
+      </w:r>
+      <w:r>
         <w:tab/>
       </w:r>
       <w:r>
-        <w:rPr>
-          <w:rFonts w:hint="default" w:ascii="Times New Roman" w:hAnsi="Times New Roman" w:cs="Times New Roman"/>
-          <w:sz w:val="26"/>
-          <w:szCs w:val="26"/>
-        </w:rPr>
         <w:fldChar w:fldCharType="begin"/>
       </w:r>
       <w:r>
-        <w:rPr>
-          <w:rFonts w:hint="default" w:ascii="Times New Roman" w:hAnsi="Times New Roman" w:cs="Times New Roman"/>
-          <w:sz w:val="26"/>
-          <w:szCs w:val="26"/>
-        </w:rPr>
-        <w:instrText xml:space="preserve"> PAGEREF _Toc10476 \h </w:instrText>
-      </w:r>
-      <w:r>
-        <w:rPr>
-          <w:rFonts w:hint="default" w:ascii="Times New Roman" w:hAnsi="Times New Roman" w:cs="Times New Roman"/>
-          <w:sz w:val="26"/>
-          <w:szCs w:val="26"/>
-        </w:rPr>
+        <w:instrText xml:space="preserve"> PAGEREF _Toc13702 \h </w:instrText>
+      </w:r>
+      <w:r>
         <w:fldChar w:fldCharType="separate"/>
       </w:r>
       <w:r>
-        <w:rPr>
-          <w:rFonts w:hint="default" w:ascii="Times New Roman" w:hAnsi="Times New Roman" w:cs="Times New Roman"/>
-          <w:sz w:val="26"/>
-          <w:szCs w:val="26"/>
-        </w:rPr>
-        <w:t>2</w:t>
-      </w:r>
-      <w:r>
-        <w:rPr>
-          <w:rFonts w:hint="default" w:ascii="Times New Roman" w:hAnsi="Times New Roman" w:cs="Times New Roman"/>
-          <w:sz w:val="26"/>
-          <w:szCs w:val="26"/>
-        </w:rPr>
+        <w:t>4</w:t>
+      </w:r>
+      <w:r>
         <w:fldChar w:fldCharType="end"/>
       </w:r>
       <w:r>
         <w:rPr>
           <w:rFonts w:hint="default" w:ascii="Times New Roman" w:hAnsi="Times New Roman" w:cs="Times New Roman"/>
-          <w:sz w:val="26"/>
           <w:szCs w:val="26"/>
           <w:lang w:val="en-US"/>
         </w:rPr>
@@ -348,255 +468,96 @@
         <w:tabs>
           <w:tab w:val="right" w:leader="dot" w:pos="8306"/>
         </w:tabs>
+      </w:pPr>
+      <w:r>
+        <w:rPr>
+          <w:rFonts w:hint="default" w:ascii="Times New Roman" w:hAnsi="Times New Roman" w:cs="Times New Roman"/>
+          <w:szCs w:val="26"/>
+          <w:lang w:val="en-US"/>
+        </w:rPr>
+        <w:fldChar w:fldCharType="begin"/>
+      </w:r>
+      <w:r>
+        <w:rPr>
+          <w:rFonts w:hint="default" w:ascii="Times New Roman" w:hAnsi="Times New Roman" w:cs="Times New Roman"/>
+          <w:szCs w:val="26"/>
+          <w:lang w:val="en-US"/>
+        </w:rPr>
+        <w:instrText xml:space="preserve"> HYPERLINK \l _Toc30694 </w:instrText>
+      </w:r>
+      <w:r>
+        <w:rPr>
+          <w:rFonts w:hint="default" w:ascii="Times New Roman" w:hAnsi="Times New Roman" w:cs="Times New Roman"/>
+          <w:szCs w:val="26"/>
+          <w:lang w:val="en-US"/>
+        </w:rPr>
+        <w:fldChar w:fldCharType="separate"/>
+      </w:r>
+      <w:r>
+        <w:rPr>
+          <w:rFonts w:hint="default" w:ascii="Times New Roman" w:hAnsi="Times New Roman" w:cs="Times New Roman"/>
+          <w:lang w:val="el-GR"/>
+        </w:rPr>
+        <w:t xml:space="preserve">Φάκελος </w:t>
+      </w:r>
+      <w:r>
+        <w:rPr>
+          <w:rFonts w:hint="default" w:ascii="Times New Roman" w:hAnsi="Times New Roman" w:cs="Times New Roman"/>
+          <w:lang w:val="en-US"/>
+        </w:rPr>
+        <w:t>SPSSettings</w:t>
+      </w:r>
+      <w:r>
+        <w:tab/>
+      </w:r>
+      <w:r>
+        <w:fldChar w:fldCharType="begin"/>
+      </w:r>
+      <w:r>
+        <w:instrText xml:space="preserve"> PAGEREF _Toc30694 \h </w:instrText>
+      </w:r>
+      <w:r>
+        <w:fldChar w:fldCharType="separate"/>
+      </w:r>
+      <w:r>
+        <w:t>5</w:t>
+      </w:r>
+      <w:r>
+        <w:fldChar w:fldCharType="end"/>
+      </w:r>
+      <w:r>
+        <w:rPr>
+          <w:rFonts w:hint="default" w:ascii="Times New Roman" w:hAnsi="Times New Roman" w:cs="Times New Roman"/>
+          <w:szCs w:val="26"/>
+          <w:lang w:val="en-US"/>
+        </w:rPr>
+        <w:fldChar w:fldCharType="end"/>
+      </w:r>
+    </w:p>
+    <w:p>
+      <w:pPr>
+        <w:jc w:val="both"/>
         <w:rPr>
           <w:rFonts w:hint="default" w:ascii="Times New Roman" w:hAnsi="Times New Roman" w:cs="Times New Roman"/>
           <w:sz w:val="26"/>
           <w:szCs w:val="26"/>
-        </w:rPr>
-      </w:pPr>
-      <w:r>
-        <w:rPr>
-          <w:rFonts w:hint="default" w:ascii="Times New Roman" w:hAnsi="Times New Roman" w:cs="Times New Roman"/>
-          <w:sz w:val="26"/>
+          <w:lang w:val="en-US"/>
+        </w:rPr>
+      </w:pPr>
+      <w:r>
+        <w:rPr>
+          <w:rFonts w:hint="default" w:ascii="Times New Roman" w:hAnsi="Times New Roman" w:cs="Times New Roman"/>
           <w:szCs w:val="26"/>
           <w:lang w:val="en-US"/>
         </w:rPr>
-        <w:fldChar w:fldCharType="begin"/>
-      </w:r>
-      <w:r>
-        <w:rPr>
-          <w:rFonts w:hint="default" w:ascii="Times New Roman" w:hAnsi="Times New Roman" w:cs="Times New Roman"/>
-          <w:sz w:val="26"/>
-          <w:szCs w:val="26"/>
-          <w:lang w:val="en-US"/>
-        </w:rPr>
-        <w:instrText xml:space="preserve"> HYPERLINK \l _Toc9993 </w:instrText>
-      </w:r>
-      <w:r>
-        <w:rPr>
-          <w:rFonts w:hint="default" w:ascii="Times New Roman" w:hAnsi="Times New Roman" w:cs="Times New Roman"/>
-          <w:sz w:val="26"/>
-          <w:szCs w:val="26"/>
-          <w:lang w:val="en-US"/>
-        </w:rPr>
-        <w:fldChar w:fldCharType="separate"/>
-      </w:r>
-      <w:r>
-        <w:rPr>
-          <w:rFonts w:hint="default" w:ascii="Times New Roman" w:hAnsi="Times New Roman" w:cs="Times New Roman"/>
-          <w:sz w:val="26"/>
-          <w:szCs w:val="26"/>
-          <w:lang w:val="el-GR"/>
-        </w:rPr>
-        <w:t xml:space="preserve">Περιγραφή του </w:t>
-      </w:r>
-      <w:r>
-        <w:rPr>
-          <w:rFonts w:hint="default" w:ascii="Times New Roman" w:hAnsi="Times New Roman" w:cs="Times New Roman"/>
-          <w:sz w:val="26"/>
-          <w:szCs w:val="26"/>
-          <w:lang w:val="en-US"/>
-        </w:rPr>
-        <w:t>Interface</w:t>
-      </w:r>
-      <w:r>
-        <w:rPr>
-          <w:rFonts w:hint="default" w:ascii="Times New Roman" w:hAnsi="Times New Roman" w:cs="Times New Roman"/>
-          <w:sz w:val="26"/>
-          <w:szCs w:val="26"/>
-        </w:rPr>
-        <w:tab/>
-      </w:r>
-      <w:r>
-        <w:rPr>
-          <w:rFonts w:hint="default" w:ascii="Times New Roman" w:hAnsi="Times New Roman" w:cs="Times New Roman"/>
-          <w:sz w:val="26"/>
-          <w:szCs w:val="26"/>
-        </w:rPr>
-        <w:fldChar w:fldCharType="begin"/>
-      </w:r>
-      <w:r>
-        <w:rPr>
-          <w:rFonts w:hint="default" w:ascii="Times New Roman" w:hAnsi="Times New Roman" w:cs="Times New Roman"/>
-          <w:sz w:val="26"/>
-          <w:szCs w:val="26"/>
-        </w:rPr>
-        <w:instrText xml:space="preserve"> PAGEREF _Toc9993 \h </w:instrText>
-      </w:r>
-      <w:r>
-        <w:rPr>
-          <w:rFonts w:hint="default" w:ascii="Times New Roman" w:hAnsi="Times New Roman" w:cs="Times New Roman"/>
-          <w:sz w:val="26"/>
-          <w:szCs w:val="26"/>
-        </w:rPr>
-        <w:fldChar w:fldCharType="separate"/>
-      </w:r>
-      <w:r>
-        <w:rPr>
-          <w:rFonts w:hint="default" w:ascii="Times New Roman" w:hAnsi="Times New Roman" w:cs="Times New Roman"/>
-          <w:sz w:val="26"/>
-          <w:szCs w:val="26"/>
-        </w:rPr>
-        <w:t>4</w:t>
-      </w:r>
-      <w:r>
-        <w:rPr>
-          <w:rFonts w:hint="default" w:ascii="Times New Roman" w:hAnsi="Times New Roman" w:cs="Times New Roman"/>
-          <w:sz w:val="26"/>
-          <w:szCs w:val="26"/>
-        </w:rPr>
         <w:fldChar w:fldCharType="end"/>
       </w:r>
-      <w:r>
-        <w:rPr>
-          <w:rFonts w:hint="default" w:ascii="Times New Roman" w:hAnsi="Times New Roman" w:cs="Times New Roman"/>
-          <w:sz w:val="26"/>
-          <w:szCs w:val="26"/>
-          <w:lang w:val="en-US"/>
-        </w:rPr>
-        <w:fldChar w:fldCharType="end"/>
-      </w:r>
-    </w:p>
-    <w:p>
-      <w:pPr>
-        <w:pStyle w:val="9"/>
-        <w:tabs>
-          <w:tab w:val="right" w:leader="dot" w:pos="8306"/>
-        </w:tabs>
-        <w:rPr>
-          <w:rFonts w:hint="default" w:ascii="Times New Roman" w:hAnsi="Times New Roman" w:cs="Times New Roman"/>
-          <w:sz w:val="26"/>
-          <w:szCs w:val="26"/>
-        </w:rPr>
-      </w:pPr>
-      <w:r>
-        <w:rPr>
-          <w:rFonts w:hint="default" w:ascii="Times New Roman" w:hAnsi="Times New Roman" w:cs="Times New Roman"/>
-          <w:sz w:val="26"/>
-          <w:szCs w:val="26"/>
-          <w:lang w:val="en-US"/>
-        </w:rPr>
-        <w:fldChar w:fldCharType="begin"/>
-      </w:r>
-      <w:r>
-        <w:rPr>
-          <w:rFonts w:hint="default" w:ascii="Times New Roman" w:hAnsi="Times New Roman" w:cs="Times New Roman"/>
-          <w:sz w:val="26"/>
-          <w:szCs w:val="26"/>
-          <w:lang w:val="en-US"/>
-        </w:rPr>
-        <w:instrText xml:space="preserve"> HYPERLINK \l _Toc1011 </w:instrText>
-      </w:r>
-      <w:r>
-        <w:rPr>
-          <w:rFonts w:hint="default" w:ascii="Times New Roman" w:hAnsi="Times New Roman" w:cs="Times New Roman"/>
-          <w:sz w:val="26"/>
-          <w:szCs w:val="26"/>
-          <w:lang w:val="en-US"/>
-        </w:rPr>
-        <w:fldChar w:fldCharType="separate"/>
-      </w:r>
-      <w:r>
-        <w:rPr>
-          <w:rFonts w:hint="default" w:ascii="Times New Roman" w:hAnsi="Times New Roman" w:cs="Times New Roman"/>
-          <w:sz w:val="26"/>
-          <w:szCs w:val="26"/>
-          <w:lang w:val="el-GR"/>
-        </w:rPr>
-        <w:t xml:space="preserve">Φάκελος </w:t>
-      </w:r>
-      <w:r>
-        <w:rPr>
-          <w:rFonts w:hint="default" w:ascii="Times New Roman" w:hAnsi="Times New Roman" w:cs="Times New Roman"/>
-          <w:sz w:val="26"/>
-          <w:szCs w:val="26"/>
-          <w:lang w:val="en-US"/>
-        </w:rPr>
-        <w:t>SPSSettings</w:t>
-      </w:r>
-      <w:r>
-        <w:rPr>
-          <w:rFonts w:hint="default" w:ascii="Times New Roman" w:hAnsi="Times New Roman" w:cs="Times New Roman"/>
-          <w:sz w:val="26"/>
-          <w:szCs w:val="26"/>
-        </w:rPr>
-        <w:tab/>
-      </w:r>
-      <w:r>
-        <w:rPr>
-          <w:rFonts w:hint="default" w:ascii="Times New Roman" w:hAnsi="Times New Roman" w:cs="Times New Roman"/>
-          <w:sz w:val="26"/>
-          <w:szCs w:val="26"/>
-        </w:rPr>
-        <w:fldChar w:fldCharType="begin"/>
-      </w:r>
-      <w:r>
-        <w:rPr>
-          <w:rFonts w:hint="default" w:ascii="Times New Roman" w:hAnsi="Times New Roman" w:cs="Times New Roman"/>
-          <w:sz w:val="26"/>
-          <w:szCs w:val="26"/>
-        </w:rPr>
-        <w:instrText xml:space="preserve"> PAGEREF _Toc1011 \h </w:instrText>
-      </w:r>
-      <w:r>
-        <w:rPr>
-          <w:rFonts w:hint="default" w:ascii="Times New Roman" w:hAnsi="Times New Roman" w:cs="Times New Roman"/>
-          <w:sz w:val="26"/>
-          <w:szCs w:val="26"/>
-        </w:rPr>
-        <w:fldChar w:fldCharType="separate"/>
-      </w:r>
-      <w:r>
-        <w:rPr>
-          <w:rFonts w:hint="default" w:ascii="Times New Roman" w:hAnsi="Times New Roman" w:cs="Times New Roman"/>
-          <w:sz w:val="26"/>
-          <w:szCs w:val="26"/>
-        </w:rPr>
-        <w:t>5</w:t>
-      </w:r>
-      <w:r>
-        <w:rPr>
-          <w:rFonts w:hint="default" w:ascii="Times New Roman" w:hAnsi="Times New Roman" w:cs="Times New Roman"/>
-          <w:sz w:val="26"/>
-          <w:szCs w:val="26"/>
-        </w:rPr>
-        <w:fldChar w:fldCharType="end"/>
-      </w:r>
-      <w:r>
-        <w:rPr>
-          <w:rFonts w:hint="default" w:ascii="Times New Roman" w:hAnsi="Times New Roman" w:cs="Times New Roman"/>
-          <w:sz w:val="26"/>
-          <w:szCs w:val="26"/>
-          <w:lang w:val="en-US"/>
-        </w:rPr>
-        <w:fldChar w:fldCharType="end"/>
-      </w:r>
-    </w:p>
-    <w:p>
-      <w:pPr>
-        <w:jc w:val="both"/>
-        <w:rPr>
-          <w:rFonts w:hint="default" w:ascii="Times New Roman" w:hAnsi="Times New Roman" w:cs="Times New Roman"/>
-          <w:sz w:val="26"/>
-          <w:szCs w:val="26"/>
-          <w:lang w:val="en-US"/>
-        </w:rPr>
-      </w:pPr>
-      <w:r>
-        <w:rPr>
-          <w:rFonts w:hint="default" w:ascii="Times New Roman" w:hAnsi="Times New Roman" w:cs="Times New Roman"/>
-          <w:sz w:val="26"/>
-          <w:szCs w:val="26"/>
-          <w:lang w:val="en-US"/>
-        </w:rPr>
-        <w:fldChar w:fldCharType="end"/>
-      </w:r>
-    </w:p>
-    <w:p>
-      <w:pPr>
-        <w:rPr>
-          <w:rFonts w:hint="default" w:ascii="Times New Roman" w:hAnsi="Times New Roman" w:cs="Times New Roman"/>
-          <w:lang w:val="el-GR"/>
+    </w:p>
+    <w:p>
+      <w:pPr>
+        <w:rPr>
+          <w:rFonts w:hint="default" w:ascii="Times New Roman" w:hAnsi="Times New Roman" w:cs="Times New Roman"/>
+          <w:lang w:val="en-US"/>
         </w:rPr>
       </w:pPr>
       <w:r>
@@ -606,116 +567,30 @@
         </w:rPr>
         <w:br w:type="page"/>
       </w:r>
+      <w:bookmarkStart w:id="10" w:name="_GoBack"/>
+      <w:bookmarkEnd w:id="10"/>
     </w:p>
     <w:p>
       <w:pPr>
         <w:pStyle w:val="3"/>
         <w:bidi w:val="0"/>
         <w:spacing w:line="240" w:lineRule="auto"/>
-        <w:jc w:val="both"/>
-        <w:rPr>
-          <w:rFonts w:hint="default" w:ascii="Times New Roman" w:hAnsi="Times New Roman" w:cs="Times New Roman"/>
-          <w:lang w:val="el-GR"/>
-        </w:rPr>
-      </w:pPr>
-      <w:bookmarkStart w:id="0" w:name="_Toc7757"/>
-      <w:bookmarkStart w:id="1" w:name="_Toc31892"/>
-      <w:r>
-        <w:rPr>
-          <w:rFonts w:hint="default" w:ascii="Times New Roman" w:hAnsi="Times New Roman" w:cs="Times New Roman"/>
-          <w:lang w:val="el-GR"/>
-        </w:rPr>
-        <w:t>Είσοδος στο πρόγραμμα</w:t>
+        <w:rPr>
+          <w:rFonts w:hint="default" w:ascii="Times New Roman" w:hAnsi="Times New Roman" w:cs="Times New Roman"/>
+          <w:lang w:val="el-GR"/>
+        </w:rPr>
+      </w:pPr>
+      <w:bookmarkStart w:id="0" w:name="_Toc26338"/>
+      <w:bookmarkStart w:id="1" w:name="_Toc20739"/>
+      <w:r>
+        <w:rPr>
+          <w:rFonts w:hint="default" w:ascii="Times New Roman" w:hAnsi="Times New Roman" w:cs="Times New Roman"/>
+          <w:lang w:val="el-GR"/>
+        </w:rPr>
+        <w:t>Πρώτη χρήση</w:t>
       </w:r>
       <w:bookmarkEnd w:id="0"/>
       <w:bookmarkEnd w:id="1"/>
-    </w:p>
-    <w:p>
-      <w:pPr>
-        <w:jc w:val="both"/>
-        <w:rPr>
-          <w:rFonts w:hint="default" w:ascii="Times New Roman" w:hAnsi="Times New Roman" w:cs="Times New Roman"/>
-          <w:lang w:val="el-GR"/>
-        </w:rPr>
-      </w:pPr>
-      <w:r>
-        <w:rPr>
-          <w:rFonts w:hint="default" w:ascii="Times New Roman" w:hAnsi="Times New Roman" w:cs="Times New Roman"/>
-        </w:rPr>
-        <w:drawing>
-          <wp:inline distT="0" distB="0" distL="114300" distR="114300">
-            <wp:extent cx="5264785" cy="2921635"/>
-            <wp:effectExtent l="0" t="0" r="12065" b="12065"/>
-            <wp:docPr id="2" name="Picture 2"/>
-            <wp:cNvGraphicFramePr>
-              <a:graphicFrameLocks xmlns:a="http://schemas.openxmlformats.org/drawingml/2006/main" noChangeAspect="1"/>
-            </wp:cNvGraphicFramePr>
-            <a:graphic xmlns:a="http://schemas.openxmlformats.org/drawingml/2006/main">
-              <a:graphicData uri="http://schemas.openxmlformats.org/drawingml/2006/picture">
-                <pic:pic xmlns:pic="http://schemas.openxmlformats.org/drawingml/2006/picture">
-                  <pic:nvPicPr>
-                    <pic:cNvPr id="2" name="Picture 2"/>
-                    <pic:cNvPicPr>
-                      <a:picLocks noChangeAspect="1"/>
-                    </pic:cNvPicPr>
-                  </pic:nvPicPr>
-                  <pic:blipFill>
-                    <a:blip r:embed="rId7"/>
-                    <a:stretch>
-                      <a:fillRect/>
-                    </a:stretch>
-                  </pic:blipFill>
-                  <pic:spPr>
-                    <a:xfrm>
-                      <a:off x="0" y="0"/>
-                      <a:ext cx="5264785" cy="2921635"/>
-                    </a:xfrm>
-                    <a:prstGeom prst="rect">
-                      <a:avLst/>
-                    </a:prstGeom>
-                    <a:noFill/>
-                    <a:ln>
-                      <a:noFill/>
-                    </a:ln>
-                  </pic:spPr>
-                </pic:pic>
-              </a:graphicData>
-            </a:graphic>
-          </wp:inline>
-        </w:drawing>
-      </w:r>
-    </w:p>
-    <w:p>
-      <w:pPr>
-        <w:jc w:val="both"/>
-        <w:rPr>
-          <w:rFonts w:hint="default" w:ascii="Times New Roman" w:hAnsi="Times New Roman" w:cs="Times New Roman"/>
-          <w:lang w:val="en-US"/>
-        </w:rPr>
-      </w:pPr>
-    </w:p>
-    <w:p>
-      <w:pPr>
-        <w:pStyle w:val="4"/>
-        <w:bidi w:val="0"/>
-        <w:spacing w:line="240" w:lineRule="auto"/>
-        <w:jc w:val="both"/>
-        <w:rPr>
-          <w:rFonts w:hint="default" w:ascii="Times New Roman" w:hAnsi="Times New Roman" w:cs="Times New Roman"/>
-          <w:lang w:val="el-GR"/>
-        </w:rPr>
-      </w:pPr>
-      <w:bookmarkStart w:id="2" w:name="_Toc10476"/>
-      <w:bookmarkStart w:id="3" w:name="_Toc26338"/>
-      <w:r>
-        <w:rPr>
-          <w:rFonts w:hint="default" w:ascii="Times New Roman" w:hAnsi="Times New Roman" w:cs="Times New Roman"/>
-          <w:lang w:val="el-GR"/>
-        </w:rPr>
-        <w:t>Πρώτη χρήση</w:t>
-      </w:r>
-      <w:bookmarkEnd w:id="2"/>
-      <w:bookmarkEnd w:id="3"/>
     </w:p>
     <w:p>
       <w:pPr>
@@ -744,7 +619,7 @@
                     </pic:cNvPicPr>
                   </pic:nvPicPr>
                   <pic:blipFill>
-                    <a:blip r:embed="rId8"/>
+                    <a:blip r:embed="rId7"/>
                     <a:stretch>
                       <a:fillRect/>
                     </a:stretch>
@@ -862,7 +737,7 @@
                     </pic:cNvPicPr>
                   </pic:nvPicPr>
                   <pic:blipFill>
-                    <a:blip r:embed="rId9"/>
+                    <a:blip r:embed="rId8"/>
                     <a:stretch>
                       <a:fillRect/>
                     </a:stretch>
@@ -982,7 +857,7 @@
                     </pic:cNvPicPr>
                   </pic:nvPicPr>
                   <pic:blipFill>
-                    <a:blip r:embed="rId10"/>
+                    <a:blip r:embed="rId9"/>
                     <a:stretch>
                       <a:fillRect/>
                     </a:stretch>
@@ -1036,18 +911,23 @@
     </w:p>
     <w:p>
       <w:pPr>
-        <w:numPr>
-          <w:ilvl w:val="0"/>
-          <w:numId w:val="0"/>
-        </w:numPr>
-        <w:jc w:val="both"/>
-        <w:rPr>
-          <w:rFonts w:hint="default" w:ascii="Times New Roman" w:hAnsi="Times New Roman" w:cs="Times New Roman"/>
-          <w:sz w:val="24"/>
-          <w:szCs w:val="24"/>
-          <w:lang w:val="en-US"/>
-        </w:rPr>
-      </w:pPr>
+        <w:pStyle w:val="3"/>
+        <w:bidi w:val="0"/>
+        <w:spacing w:line="240" w:lineRule="auto"/>
+        <w:rPr>
+          <w:rFonts w:hint="default" w:ascii="Times New Roman" w:hAnsi="Times New Roman" w:cs="Times New Roman"/>
+          <w:lang w:val="el-GR"/>
+        </w:rPr>
+      </w:pPr>
+      <w:bookmarkStart w:id="2" w:name="_Toc7275"/>
+      <w:r>
+        <w:rPr>
+          <w:rFonts w:hint="default" w:ascii="Times New Roman" w:hAnsi="Times New Roman" w:cs="Times New Roman"/>
+          <w:lang w:val="el-GR"/>
+        </w:rPr>
+        <w:t>Είσοδος στο πρόγραμμα</w:t>
+      </w:r>
+      <w:bookmarkEnd w:id="2"/>
     </w:p>
     <w:p>
       <w:pPr>
@@ -1214,7 +1094,7 @@
                     </pic:cNvPicPr>
                   </pic:nvPicPr>
                   <pic:blipFill>
-                    <a:blip r:embed="rId11"/>
+                    <a:blip r:embed="rId10"/>
                     <a:stretch>
                       <a:fillRect/>
                     </a:stretch>
@@ -1309,8 +1189,8 @@
           <w:lang w:val="en-US"/>
         </w:rPr>
       </w:pPr>
-      <w:bookmarkStart w:id="4" w:name="_Toc19508"/>
-      <w:bookmarkStart w:id="5" w:name="_Toc9993"/>
+      <w:bookmarkStart w:id="3" w:name="_Toc19508"/>
+      <w:bookmarkStart w:id="4" w:name="_Toc30074"/>
       <w:r>
         <w:rPr>
           <w:rFonts w:hint="default" w:ascii="Times New Roman" w:hAnsi="Times New Roman" w:cs="Times New Roman"/>
@@ -1325,8 +1205,8 @@
         </w:rPr>
         <w:t>Interface</w:t>
       </w:r>
+      <w:bookmarkEnd w:id="3"/>
       <w:bookmarkEnd w:id="4"/>
-      <w:bookmarkEnd w:id="5"/>
     </w:p>
     <w:p>
       <w:pPr>
@@ -1371,6 +1251,7 @@
           <w:lang w:val="en-US"/>
         </w:rPr>
       </w:pPr>
+      <w:bookmarkStart w:id="5" w:name="_Toc31335"/>
       <w:r>
         <w:rPr>
           <w:rFonts w:hint="default"/>
@@ -1378,6 +1259,7 @@
         </w:rPr>
         <w:t>User</w:t>
       </w:r>
+      <w:bookmarkEnd w:id="5"/>
     </w:p>
     <w:p>
       <w:pPr>
@@ -1417,7 +1299,7 @@
                     </pic:cNvPicPr>
                   </pic:nvPicPr>
                   <pic:blipFill>
-                    <a:blip r:embed="rId12"/>
+                    <a:blip r:embed="rId11"/>
                     <a:stretch>
                       <a:fillRect/>
                     </a:stretch>
@@ -1644,6 +1526,7 @@
           <w:lang w:val="en-US"/>
         </w:rPr>
       </w:pPr>
+      <w:bookmarkStart w:id="6" w:name="_Toc13702"/>
       <w:r>
         <w:rPr>
           <w:rFonts w:hint="default"/>
@@ -1651,6 +1534,7 @@
         </w:rPr>
         <w:t>Admin</w:t>
       </w:r>
+      <w:bookmarkEnd w:id="6"/>
     </w:p>
     <w:p>
       <w:pPr>
@@ -1690,7 +1574,7 @@
                     </pic:cNvPicPr>
                   </pic:nvPicPr>
                   <pic:blipFill>
-                    <a:blip r:embed="rId13"/>
+                    <a:blip r:embed="rId12"/>
                     <a:stretch>
                       <a:fillRect/>
                     </a:stretch>
@@ -2034,8 +1918,8 @@
           <w:lang w:val="en-US"/>
         </w:rPr>
       </w:pPr>
-      <w:bookmarkStart w:id="6" w:name="_Toc1011"/>
       <w:bookmarkStart w:id="7" w:name="_Toc31484"/>
+      <w:bookmarkStart w:id="8" w:name="_Toc30694"/>
       <w:r>
         <w:rPr>
           <w:rFonts w:hint="default" w:ascii="Times New Roman" w:hAnsi="Times New Roman" w:cs="Times New Roman"/>
@@ -2050,8 +1934,8 @@
         </w:rPr>
         <w:t>SPSSettings</w:t>
       </w:r>
-      <w:bookmarkEnd w:id="6"/>
       <w:bookmarkEnd w:id="7"/>
+      <w:bookmarkEnd w:id="8"/>
     </w:p>
     <w:p>
       <w:pPr>
@@ -2230,6 +2114,7 @@
     <w:p>
       <w:pPr>
         <w:numPr>
+          <w:ilvl w:val="0"/>
           <w:numId w:val="0"/>
         </w:numPr>
         <w:ind w:leftChars="0"/>
@@ -2245,6 +2130,7 @@
     <w:p>
       <w:pPr>
         <w:numPr>
+          <w:ilvl w:val="0"/>
           <w:numId w:val="0"/>
         </w:numPr>
         <w:ind w:leftChars="0"/>
@@ -2373,8 +2259,6 @@
         </w:rPr>
         <w:t>που να λεει οτι το εκανα εγω</w:t>
       </w:r>
-      <w:bookmarkStart w:id="9" w:name="_GoBack"/>
-      <w:bookmarkEnd w:id="9"/>
     </w:p>
     <w:sectPr>
       <w:footerReference r:id="rId4" w:type="default"/>
@@ -2430,22 +2314,6 @@
                       <a:ln w="6350">
                         <a:noFill/>
                       </a:ln>
-                      <a:extLst>
-                        <a:ext uri="{909E8E84-426E-40DD-AFC4-6F175D3DCCD1}">
-                          <a14:hiddenFill xmlns:a14="http://schemas.microsoft.com/office/drawing/2010/main">
-                            <a:solidFill>
-                              <a:schemeClr val="lt1"/>
-                            </a:solidFill>
-                          </a14:hiddenFill>
-                        </a:ext>
-                        <a:ext uri="{91240B29-F687-4F45-9708-019B960494DF}">
-                          <a14:hiddenLine xmlns:a14="http://schemas.microsoft.com/office/drawing/2010/main" w="6350">
-                            <a:solidFill>
-                              <a:prstClr val="black"/>
-                            </a:solidFill>
-                          </a14:hiddenLine>
-                        </a:ext>
-                      </a:extLst>
                     </wps:spPr>
                     <wps:style>
                       <a:lnRef idx="0">
@@ -2481,7 +2349,7 @@
         </mc:Choice>
         <mc:Fallback>
           <w:pict>
-            <v:shape id="_x0000_s1026" o:spid="_x0000_s1026" o:spt="202" type="#_x0000_t202" style="position:absolute;left:0pt;margin-top:0pt;height:144pt;width:144pt;mso-position-horizontal:right;mso-position-horizontal-relative:margin;mso-wrap-style:none;z-index:251659264;mso-width-relative:page;mso-height-relative:page;" filled="f" stroked="f" coordsize="21600,21600" o:gfxdata="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">
+            <v:shape id="_x0000_s1026" o:spid="_x0000_s1026" o:spt="202" type="#_x0000_t202" style="position:absolute;left:0pt;margin-top:0pt;height:144pt;width:144pt;mso-position-horizontal:right;mso-position-horizontal-relative:margin;mso-wrap-style:none;z-index:251659264;mso-width-relative:page;mso-height-relative:page;" filled="f" stroked="f" coordsize="21600,21600" o:gfxdata="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">
               <v:fill on="f" focussize="0,0"/>
               <v:stroke on="f" weight="0.5pt"/>
               <v:imagedata o:title=""/>
@@ -3150,6 +3018,7 @@
     <w:name w:val="无间隔 Char"/>
     <w:basedOn w:val="5"/>
     <w:link w:val="12"/>
+    <w:qFormat/>
     <w:uiPriority w:val="0"/>
     <w:rPr>
       <w:rFonts w:hint="default" w:ascii="Times New Roman" w:hAnsi="Times New Roman" w:eastAsia="SimSun"/>
@@ -3159,6 +3028,7 @@
   <w:style w:type="paragraph" w:customStyle="1" w:styleId="12">
     <w:name w:val="No Spacing"/>
     <w:link w:val="11"/>
+    <w:qFormat/>
     <w:uiPriority w:val="0"/>
     <w:rPr>
       <w:rFonts w:hint="default" w:ascii="Times New Roman" w:hAnsi="Times New Roman" w:eastAsia="SimSun" w:cstheme="minorBidi"/>

</xml_diff>